<commit_message>
Reproduce M3 analyses with corrected slice timing
</commit_message>
<xml_diff>
--- a/results/tables/supplementary/supp_all_methods.docx
+++ b/results/tables/supplementary/supp_all_methods.docx
@@ -33,16 +33,18 @@
         <w:tblLook w:firstColumn="1" w:firstRow="1" w:lastColumn="0" w:lastRow="0" w:noHBand="0" w:noVBand="1" w:val="04A0"/>
       </w:tblPr>
       <w:tblGrid>
-        <w:gridCol w:w="1296"/>
-        <w:gridCol w:w="1296"/>
-        <w:gridCol w:w="1296"/>
-        <w:gridCol w:w="1296"/>
-        <w:gridCol w:w="1296"/>
-        <w:gridCol w:w="1296"/>
-        <w:gridCol w:w="1296"/>
-        <w:gridCol w:w="1296"/>
-        <w:gridCol w:w="1296"/>
-        <w:gridCol w:w="1296"/>
+        <w:gridCol w:w="1080"/>
+        <w:gridCol w:w="1080"/>
+        <w:gridCol w:w="1080"/>
+        <w:gridCol w:w="1080"/>
+        <w:gridCol w:w="1080"/>
+        <w:gridCol w:w="1080"/>
+        <w:gridCol w:w="1080"/>
+        <w:gridCol w:w="1080"/>
+        <w:gridCol w:w="1080"/>
+        <w:gridCol w:w="1080"/>
+        <w:gridCol w:w="1080"/>
+        <w:gridCol w:w="1080"/>
       </w:tblGrid>
       <w:tr>
         <w:tc>
@@ -110,7 +112,7 @@
         </w:tc>
         <w:tc>
           <w:tcPr>
-            <w:tcW w:type="dxa" w:w="576"/>
+            <w:tcW w:type="dxa" w:w="720"/>
             <w:shd w:val="clear" w:color="auto" w:fill="2F2F2F"/>
           </w:tcPr>
           <w:p>
@@ -125,7 +127,7 @@
                 <w:color w:val="FFFFFF"/>
                 <w:sz w:val="20"/>
               </w:rPr>
-              <w:t>N</w:t>
+              <w:t>N correlation</w:t>
             </w:r>
           </w:p>
         </w:tc>
@@ -173,6 +175,27 @@
         </w:tc>
         <w:tc>
           <w:tcPr>
+            <w:tcW w:type="dxa" w:w="720"/>
+            <w:shd w:val="clear" w:color="auto" w:fill="2F2F2F"/>
+          </w:tcPr>
+          <w:p>
+            <w:pPr>
+              <w:jc w:val="right"/>
+            </w:pPr>
+            <w:r/>
+            <w:r>
+              <w:rPr>
+                <w:rFonts w:ascii="Times New Roman" w:hAnsi="Times New Roman"/>
+                <w:b/>
+                <w:color w:val="FFFFFF"/>
+                <w:sz w:val="20"/>
+              </w:rPr>
+              <w:t>N OLS</w:t>
+            </w:r>
+          </w:p>
+        </w:tc>
+        <w:tc>
+          <w:tcPr>
             <w:tcW w:type="dxa" w:w="1080"/>
             <w:shd w:val="clear" w:color="auto" w:fill="2F2F2F"/>
           </w:tcPr>
@@ -210,6 +233,27 @@
                 <w:sz w:val="20"/>
               </w:rPr>
               <w:t>OLS p</w:t>
+            </w:r>
+          </w:p>
+        </w:tc>
+        <w:tc>
+          <w:tcPr>
+            <w:tcW w:type="dxa" w:w="720"/>
+            <w:shd w:val="clear" w:color="auto" w:fill="2F2F2F"/>
+          </w:tcPr>
+          <w:p>
+            <w:pPr>
+              <w:jc w:val="right"/>
+            </w:pPr>
+            <w:r/>
+            <w:r>
+              <w:rPr>
+                <w:rFonts w:ascii="Times New Roman" w:hAnsi="Times New Roman"/>
+                <w:b/>
+                <w:color w:val="FFFFFF"/>
+                <w:sz w:val="20"/>
+              </w:rPr>
+              <w:t>N MLM</w:t>
             </w:r>
           </w:p>
         </w:tc>
@@ -259,7 +303,7 @@
       <w:tr>
         <w:tc>
           <w:tcPr>
-            <w:tcW w:type="dxa" w:w="1296"/>
+            <w:tcW w:type="dxa" w:w="1080"/>
             <w:shd w:val="clear" w:color="auto" w:fill="D9D9D9"/>
           </w:tcPr>
           <w:p>
@@ -279,7 +323,7 @@
         </w:tc>
         <w:tc>
           <w:tcPr>
-            <w:tcW w:type="dxa" w:w="1296"/>
+            <w:tcW w:type="dxa" w:w="1080"/>
             <w:shd w:val="clear" w:color="auto" w:fill="D9D9D9"/>
           </w:tcPr>
           <w:p>
@@ -299,7 +343,7 @@
         </w:tc>
         <w:tc>
           <w:tcPr>
-            <w:tcW w:type="dxa" w:w="1296"/>
+            <w:tcW w:type="dxa" w:w="1080"/>
             <w:shd w:val="clear" w:color="auto" w:fill="D9D9D9"/>
           </w:tcPr>
           <w:p>
@@ -319,7 +363,7 @@
         </w:tc>
         <w:tc>
           <w:tcPr>
-            <w:tcW w:type="dxa" w:w="1296"/>
+            <w:tcW w:type="dxa" w:w="1080"/>
             <w:shd w:val="clear" w:color="auto" w:fill="D9D9D9"/>
           </w:tcPr>
           <w:p>
@@ -339,7 +383,7 @@
         </w:tc>
         <w:tc>
           <w:tcPr>
-            <w:tcW w:type="dxa" w:w="1296"/>
+            <w:tcW w:type="dxa" w:w="1080"/>
             <w:shd w:val="clear" w:color="auto" w:fill="D9D9D9"/>
           </w:tcPr>
           <w:p>
@@ -359,7 +403,7 @@
         </w:tc>
         <w:tc>
           <w:tcPr>
-            <w:tcW w:type="dxa" w:w="1296"/>
+            <w:tcW w:type="dxa" w:w="1080"/>
             <w:shd w:val="clear" w:color="auto" w:fill="D9D9D9"/>
           </w:tcPr>
           <w:p>
@@ -379,7 +423,27 @@
         </w:tc>
         <w:tc>
           <w:tcPr>
-            <w:tcW w:type="dxa" w:w="1296"/>
+            <w:tcW w:type="dxa" w:w="1080"/>
+            <w:shd w:val="clear" w:color="auto" w:fill="D9D9D9"/>
+          </w:tcPr>
+          <w:p>
+            <w:pPr>
+              <w:jc w:val="right"/>
+            </w:pPr>
+            <w:r/>
+            <w:r>
+              <w:rPr>
+                <w:rFonts w:ascii="Times New Roman" w:hAnsi="Times New Roman"/>
+                <w:b w:val="0"/>
+                <w:sz w:val="20"/>
+              </w:rPr>
+              <w:t>1168</w:t>
+            </w:r>
+          </w:p>
+        </w:tc>
+        <w:tc>
+          <w:tcPr>
+            <w:tcW w:type="dxa" w:w="1080"/>
             <w:shd w:val="clear" w:color="auto" w:fill="D9D9D9"/>
           </w:tcPr>
           <w:p>
@@ -399,7 +463,7 @@
         </w:tc>
         <w:tc>
           <w:tcPr>
-            <w:tcW w:type="dxa" w:w="1296"/>
+            <w:tcW w:type="dxa" w:w="1080"/>
             <w:shd w:val="clear" w:color="auto" w:fill="D9D9D9"/>
           </w:tcPr>
           <w:p>
@@ -419,7 +483,27 @@
         </w:tc>
         <w:tc>
           <w:tcPr>
-            <w:tcW w:type="dxa" w:w="1296"/>
+            <w:tcW w:type="dxa" w:w="1080"/>
+            <w:shd w:val="clear" w:color="auto" w:fill="D9D9D9"/>
+          </w:tcPr>
+          <w:p>
+            <w:pPr>
+              <w:jc w:val="right"/>
+            </w:pPr>
+            <w:r/>
+            <w:r>
+              <w:rPr>
+                <w:rFonts w:ascii="Times New Roman" w:hAnsi="Times New Roman"/>
+                <w:b w:val="0"/>
+                <w:sz w:val="20"/>
+              </w:rPr>
+              <w:t>1168</w:t>
+            </w:r>
+          </w:p>
+        </w:tc>
+        <w:tc>
+          <w:tcPr>
+            <w:tcW w:type="dxa" w:w="1080"/>
             <w:shd w:val="clear" w:color="auto" w:fill="D9D9D9"/>
           </w:tcPr>
           <w:p>
@@ -439,7 +523,7 @@
         </w:tc>
         <w:tc>
           <w:tcPr>
-            <w:tcW w:type="dxa" w:w="1296"/>
+            <w:tcW w:type="dxa" w:w="1080"/>
             <w:shd w:val="clear" w:color="auto" w:fill="D9D9D9"/>
           </w:tcPr>
           <w:p>
@@ -461,7 +545,7 @@
       <w:tr>
         <w:tc>
           <w:tcPr>
-            <w:tcW w:type="dxa" w:w="1296"/>
+            <w:tcW w:type="dxa" w:w="1080"/>
             <w:shd w:val="clear" w:color="auto" w:fill="F2F2F2"/>
           </w:tcPr>
           <w:p>
@@ -481,7 +565,7 @@
         </w:tc>
         <w:tc>
           <w:tcPr>
-            <w:tcW w:type="dxa" w:w="1296"/>
+            <w:tcW w:type="dxa" w:w="1080"/>
             <w:shd w:val="clear" w:color="auto" w:fill="F2F2F2"/>
           </w:tcPr>
           <w:p>
@@ -501,7 +585,7 @@
         </w:tc>
         <w:tc>
           <w:tcPr>
-            <w:tcW w:type="dxa" w:w="1296"/>
+            <w:tcW w:type="dxa" w:w="1080"/>
             <w:shd w:val="clear" w:color="auto" w:fill="F2F2F2"/>
           </w:tcPr>
           <w:p>
@@ -521,7 +605,7 @@
         </w:tc>
         <w:tc>
           <w:tcPr>
-            <w:tcW w:type="dxa" w:w="1296"/>
+            <w:tcW w:type="dxa" w:w="1080"/>
             <w:shd w:val="clear" w:color="auto" w:fill="F2F2F2"/>
           </w:tcPr>
           <w:p>
@@ -541,7 +625,7 @@
         </w:tc>
         <w:tc>
           <w:tcPr>
-            <w:tcW w:type="dxa" w:w="1296"/>
+            <w:tcW w:type="dxa" w:w="1080"/>
             <w:shd w:val="clear" w:color="auto" w:fill="F2F2F2"/>
           </w:tcPr>
           <w:p>
@@ -561,7 +645,7 @@
         </w:tc>
         <w:tc>
           <w:tcPr>
-            <w:tcW w:type="dxa" w:w="1296"/>
+            <w:tcW w:type="dxa" w:w="1080"/>
             <w:shd w:val="clear" w:color="auto" w:fill="F2F2F2"/>
           </w:tcPr>
           <w:p>
@@ -581,7 +665,27 @@
         </w:tc>
         <w:tc>
           <w:tcPr>
-            <w:tcW w:type="dxa" w:w="1296"/>
+            <w:tcW w:type="dxa" w:w="1080"/>
+            <w:shd w:val="clear" w:color="auto" w:fill="F2F2F2"/>
+          </w:tcPr>
+          <w:p>
+            <w:pPr>
+              <w:jc w:val="right"/>
+            </w:pPr>
+            <w:r/>
+            <w:r>
+              <w:rPr>
+                <w:rFonts w:ascii="Times New Roman" w:hAnsi="Times New Roman"/>
+                <w:b w:val="0"/>
+                <w:sz w:val="20"/>
+              </w:rPr>
+              <w:t>1168</w:t>
+            </w:r>
+          </w:p>
+        </w:tc>
+        <w:tc>
+          <w:tcPr>
+            <w:tcW w:type="dxa" w:w="1080"/>
             <w:shd w:val="clear" w:color="auto" w:fill="F2F2F2"/>
           </w:tcPr>
           <w:p>
@@ -601,7 +705,7 @@
         </w:tc>
         <w:tc>
           <w:tcPr>
-            <w:tcW w:type="dxa" w:w="1296"/>
+            <w:tcW w:type="dxa" w:w="1080"/>
             <w:shd w:val="clear" w:color="auto" w:fill="F2F2F2"/>
           </w:tcPr>
           <w:p>
@@ -621,7 +725,27 @@
         </w:tc>
         <w:tc>
           <w:tcPr>
-            <w:tcW w:type="dxa" w:w="1296"/>
+            <w:tcW w:type="dxa" w:w="1080"/>
+            <w:shd w:val="clear" w:color="auto" w:fill="F2F2F2"/>
+          </w:tcPr>
+          <w:p>
+            <w:pPr>
+              <w:jc w:val="right"/>
+            </w:pPr>
+            <w:r/>
+            <w:r>
+              <w:rPr>
+                <w:rFonts w:ascii="Times New Roman" w:hAnsi="Times New Roman"/>
+                <w:b w:val="0"/>
+                <w:sz w:val="20"/>
+              </w:rPr>
+              <w:t>1168</w:t>
+            </w:r>
+          </w:p>
+        </w:tc>
+        <w:tc>
+          <w:tcPr>
+            <w:tcW w:type="dxa" w:w="1080"/>
             <w:shd w:val="clear" w:color="auto" w:fill="F2F2F2"/>
           </w:tcPr>
           <w:p>
@@ -641,7 +765,7 @@
         </w:tc>
         <w:tc>
           <w:tcPr>
-            <w:tcW w:type="dxa" w:w="1296"/>
+            <w:tcW w:type="dxa" w:w="1080"/>
             <w:shd w:val="clear" w:color="auto" w:fill="F2F2F2"/>
           </w:tcPr>
           <w:p>
@@ -663,7 +787,7 @@
       <w:tr>
         <w:tc>
           <w:tcPr>
-            <w:tcW w:type="dxa" w:w="1296"/>
+            <w:tcW w:type="dxa" w:w="1080"/>
             <w:shd w:val="clear" w:color="auto" w:fill="FFFFFF"/>
           </w:tcPr>
           <w:p>
@@ -683,7 +807,7 @@
         </w:tc>
         <w:tc>
           <w:tcPr>
-            <w:tcW w:type="dxa" w:w="1296"/>
+            <w:tcW w:type="dxa" w:w="1080"/>
             <w:shd w:val="clear" w:color="auto" w:fill="FFFFFF"/>
           </w:tcPr>
           <w:p>
@@ -703,7 +827,7 @@
         </w:tc>
         <w:tc>
           <w:tcPr>
-            <w:tcW w:type="dxa" w:w="1296"/>
+            <w:tcW w:type="dxa" w:w="1080"/>
             <w:shd w:val="clear" w:color="auto" w:fill="FFFFFF"/>
           </w:tcPr>
           <w:p>
@@ -723,7 +847,7 @@
         </w:tc>
         <w:tc>
           <w:tcPr>
-            <w:tcW w:type="dxa" w:w="1296"/>
+            <w:tcW w:type="dxa" w:w="1080"/>
             <w:shd w:val="clear" w:color="auto" w:fill="FFFFFF"/>
           </w:tcPr>
           <w:p>
@@ -743,7 +867,7 @@
         </w:tc>
         <w:tc>
           <w:tcPr>
-            <w:tcW w:type="dxa" w:w="1296"/>
+            <w:tcW w:type="dxa" w:w="1080"/>
             <w:shd w:val="clear" w:color="auto" w:fill="FFFFFF"/>
           </w:tcPr>
           <w:p>
@@ -763,7 +887,7 @@
         </w:tc>
         <w:tc>
           <w:tcPr>
-            <w:tcW w:type="dxa" w:w="1296"/>
+            <w:tcW w:type="dxa" w:w="1080"/>
             <w:shd w:val="clear" w:color="auto" w:fill="FFFFFF"/>
           </w:tcPr>
           <w:p>
@@ -783,7 +907,27 @@
         </w:tc>
         <w:tc>
           <w:tcPr>
-            <w:tcW w:type="dxa" w:w="1296"/>
+            <w:tcW w:type="dxa" w:w="1080"/>
+            <w:shd w:val="clear" w:color="auto" w:fill="FFFFFF"/>
+          </w:tcPr>
+          <w:p>
+            <w:pPr>
+              <w:jc w:val="right"/>
+            </w:pPr>
+            <w:r/>
+            <w:r>
+              <w:rPr>
+                <w:rFonts w:ascii="Times New Roman" w:hAnsi="Times New Roman"/>
+                <w:b w:val="0"/>
+                <w:sz w:val="20"/>
+              </w:rPr>
+              <w:t>1168</w:t>
+            </w:r>
+          </w:p>
+        </w:tc>
+        <w:tc>
+          <w:tcPr>
+            <w:tcW w:type="dxa" w:w="1080"/>
             <w:shd w:val="clear" w:color="auto" w:fill="FFFFFF"/>
           </w:tcPr>
           <w:p>
@@ -803,7 +947,7 @@
         </w:tc>
         <w:tc>
           <w:tcPr>
-            <w:tcW w:type="dxa" w:w="1296"/>
+            <w:tcW w:type="dxa" w:w="1080"/>
             <w:shd w:val="clear" w:color="auto" w:fill="FFFFFF"/>
           </w:tcPr>
           <w:p>
@@ -823,7 +967,27 @@
         </w:tc>
         <w:tc>
           <w:tcPr>
-            <w:tcW w:type="dxa" w:w="1296"/>
+            <w:tcW w:type="dxa" w:w="1080"/>
+            <w:shd w:val="clear" w:color="auto" w:fill="FFFFFF"/>
+          </w:tcPr>
+          <w:p>
+            <w:pPr>
+              <w:jc w:val="right"/>
+            </w:pPr>
+            <w:r/>
+            <w:r>
+              <w:rPr>
+                <w:rFonts w:ascii="Times New Roman" w:hAnsi="Times New Roman"/>
+                <w:b w:val="0"/>
+                <w:sz w:val="20"/>
+              </w:rPr>
+              <w:t>1168</w:t>
+            </w:r>
+          </w:p>
+        </w:tc>
+        <w:tc>
+          <w:tcPr>
+            <w:tcW w:type="dxa" w:w="1080"/>
             <w:shd w:val="clear" w:color="auto" w:fill="FFFFFF"/>
           </w:tcPr>
           <w:p>
@@ -843,7 +1007,7 @@
         </w:tc>
         <w:tc>
           <w:tcPr>
-            <w:tcW w:type="dxa" w:w="1296"/>
+            <w:tcW w:type="dxa" w:w="1080"/>
             <w:shd w:val="clear" w:color="auto" w:fill="FFFFFF"/>
           </w:tcPr>
           <w:p>
@@ -865,7 +1029,7 @@
       <w:tr>
         <w:tc>
           <w:tcPr>
-            <w:tcW w:type="dxa" w:w="1296"/>
+            <w:tcW w:type="dxa" w:w="1080"/>
             <w:shd w:val="clear" w:color="auto" w:fill="D9D9D9"/>
           </w:tcPr>
           <w:p>
@@ -885,7 +1049,7 @@
         </w:tc>
         <w:tc>
           <w:tcPr>
-            <w:tcW w:type="dxa" w:w="1296"/>
+            <w:tcW w:type="dxa" w:w="1080"/>
             <w:shd w:val="clear" w:color="auto" w:fill="D9D9D9"/>
           </w:tcPr>
           <w:p>
@@ -905,7 +1069,7 @@
         </w:tc>
         <w:tc>
           <w:tcPr>
-            <w:tcW w:type="dxa" w:w="1296"/>
+            <w:tcW w:type="dxa" w:w="1080"/>
             <w:shd w:val="clear" w:color="auto" w:fill="D9D9D9"/>
           </w:tcPr>
           <w:p>
@@ -925,7 +1089,7 @@
         </w:tc>
         <w:tc>
           <w:tcPr>
-            <w:tcW w:type="dxa" w:w="1296"/>
+            <w:tcW w:type="dxa" w:w="1080"/>
             <w:shd w:val="clear" w:color="auto" w:fill="D9D9D9"/>
           </w:tcPr>
           <w:p>
@@ -939,13 +1103,13 @@
                 <w:b w:val="0"/>
                 <w:sz w:val="20"/>
               </w:rPr>
-              <w:t>80</w:t>
+              <w:t>81</w:t>
             </w:r>
           </w:p>
         </w:tc>
         <w:tc>
           <w:tcPr>
-            <w:tcW w:type="dxa" w:w="1296"/>
+            <w:tcW w:type="dxa" w:w="1080"/>
             <w:shd w:val="clear" w:color="auto" w:fill="D9D9D9"/>
           </w:tcPr>
           <w:p>
@@ -959,13 +1123,13 @@
                 <w:b w:val="0"/>
                 <w:sz w:val="20"/>
               </w:rPr>
-              <w:t>-0.276</w:t>
+              <w:t>-0.293</w:t>
             </w:r>
           </w:p>
         </w:tc>
         <w:tc>
           <w:tcPr>
-            <w:tcW w:type="dxa" w:w="1296"/>
+            <w:tcW w:type="dxa" w:w="1080"/>
             <w:shd w:val="clear" w:color="auto" w:fill="D9D9D9"/>
           </w:tcPr>
           <w:p>
@@ -979,13 +1143,13 @@
                 <w:b/>
                 <w:sz w:val="20"/>
               </w:rPr>
-              <w:t>0.007**</w:t>
+              <w:t>0.004**</w:t>
             </w:r>
           </w:p>
         </w:tc>
         <w:tc>
           <w:tcPr>
-            <w:tcW w:type="dxa" w:w="1296"/>
+            <w:tcW w:type="dxa" w:w="1080"/>
             <w:shd w:val="clear" w:color="auto" w:fill="D9D9D9"/>
           </w:tcPr>
           <w:p>
@@ -999,13 +1163,33 @@
                 <w:b w:val="0"/>
                 <w:sz w:val="20"/>
               </w:rPr>
-              <w:t>-2.37</w:t>
+              <w:t>81</w:t>
             </w:r>
           </w:p>
         </w:tc>
         <w:tc>
           <w:tcPr>
-            <w:tcW w:type="dxa" w:w="1296"/>
+            <w:tcW w:type="dxa" w:w="1080"/>
+            <w:shd w:val="clear" w:color="auto" w:fill="D9D9D9"/>
+          </w:tcPr>
+          <w:p>
+            <w:pPr>
+              <w:jc w:val="right"/>
+            </w:pPr>
+            <w:r/>
+            <w:r>
+              <w:rPr>
+                <w:rFonts w:ascii="Times New Roman" w:hAnsi="Times New Roman"/>
+                <w:b w:val="0"/>
+                <w:sz w:val="20"/>
+              </w:rPr>
+              <w:t>-2.6</w:t>
+            </w:r>
+          </w:p>
+        </w:tc>
+        <w:tc>
+          <w:tcPr>
+            <w:tcW w:type="dxa" w:w="1080"/>
             <w:shd w:val="clear" w:color="auto" w:fill="D9D9D9"/>
           </w:tcPr>
           <w:p>
@@ -1019,13 +1203,13 @@
                 <w:b/>
                 <w:sz w:val="20"/>
               </w:rPr>
-              <w:t>0.010*</w:t>
+              <w:t>0.006**</w:t>
             </w:r>
           </w:p>
         </w:tc>
         <w:tc>
           <w:tcPr>
-            <w:tcW w:type="dxa" w:w="1296"/>
+            <w:tcW w:type="dxa" w:w="1080"/>
             <w:shd w:val="clear" w:color="auto" w:fill="D9D9D9"/>
           </w:tcPr>
           <w:p>
@@ -1039,13 +1223,13 @@
                 <w:b w:val="0"/>
                 <w:sz w:val="20"/>
               </w:rPr>
-              <w:t>-1.75</w:t>
+              <w:t>81</w:t>
             </w:r>
           </w:p>
         </w:tc>
         <w:tc>
           <w:tcPr>
-            <w:tcW w:type="dxa" w:w="1296"/>
+            <w:tcW w:type="dxa" w:w="1080"/>
             <w:shd w:val="clear" w:color="auto" w:fill="D9D9D9"/>
           </w:tcPr>
           <w:p>
@@ -1056,10 +1240,30 @@
             <w:r>
               <w:rPr>
                 <w:rFonts w:ascii="Times New Roman" w:hAnsi="Times New Roman"/>
-                <w:b/>
+                <w:b w:val="0"/>
                 <w:sz w:val="20"/>
               </w:rPr>
-              <w:t>0.040*</w:t>
+              <w:t>-1.47</w:t>
+            </w:r>
+          </w:p>
+        </w:tc>
+        <w:tc>
+          <w:tcPr>
+            <w:tcW w:type="dxa" w:w="1080"/>
+            <w:shd w:val="clear" w:color="auto" w:fill="D9D9D9"/>
+          </w:tcPr>
+          <w:p>
+            <w:pPr>
+              <w:jc w:val="right"/>
+            </w:pPr>
+            <w:r/>
+            <w:r>
+              <w:rPr>
+                <w:rFonts w:ascii="Times New Roman" w:hAnsi="Times New Roman"/>
+                <w:b w:val="0"/>
+                <w:sz w:val="20"/>
+              </w:rPr>
+              <w:t>0.071</w:t>
             </w:r>
           </w:p>
         </w:tc>
@@ -1067,7 +1271,7 @@
       <w:tr>
         <w:tc>
           <w:tcPr>
-            <w:tcW w:type="dxa" w:w="1296"/>
+            <w:tcW w:type="dxa" w:w="1080"/>
             <w:shd w:val="clear" w:color="auto" w:fill="F2F2F2"/>
           </w:tcPr>
           <w:p>
@@ -1087,7 +1291,7 @@
         </w:tc>
         <w:tc>
           <w:tcPr>
-            <w:tcW w:type="dxa" w:w="1296"/>
+            <w:tcW w:type="dxa" w:w="1080"/>
             <w:shd w:val="clear" w:color="auto" w:fill="F2F2F2"/>
           </w:tcPr>
           <w:p>
@@ -1107,7 +1311,7 @@
         </w:tc>
         <w:tc>
           <w:tcPr>
-            <w:tcW w:type="dxa" w:w="1296"/>
+            <w:tcW w:type="dxa" w:w="1080"/>
             <w:shd w:val="clear" w:color="auto" w:fill="F2F2F2"/>
           </w:tcPr>
           <w:p>
@@ -1127,7 +1331,7 @@
         </w:tc>
         <w:tc>
           <w:tcPr>
-            <w:tcW w:type="dxa" w:w="1296"/>
+            <w:tcW w:type="dxa" w:w="1080"/>
             <w:shd w:val="clear" w:color="auto" w:fill="F2F2F2"/>
           </w:tcPr>
           <w:p>
@@ -1141,13 +1345,13 @@
                 <w:b w:val="0"/>
                 <w:sz w:val="20"/>
               </w:rPr>
-              <w:t>80</w:t>
+              <w:t>81</w:t>
             </w:r>
           </w:p>
         </w:tc>
         <w:tc>
           <w:tcPr>
-            <w:tcW w:type="dxa" w:w="1296"/>
+            <w:tcW w:type="dxa" w:w="1080"/>
             <w:shd w:val="clear" w:color="auto" w:fill="F2F2F2"/>
           </w:tcPr>
           <w:p>
@@ -1161,13 +1365,13 @@
                 <w:b w:val="0"/>
                 <w:sz w:val="20"/>
               </w:rPr>
-              <w:t>0.234</w:t>
+              <w:t>0.217</w:t>
             </w:r>
           </w:p>
         </w:tc>
         <w:tc>
           <w:tcPr>
-            <w:tcW w:type="dxa" w:w="1296"/>
+            <w:tcW w:type="dxa" w:w="1080"/>
             <w:shd w:val="clear" w:color="auto" w:fill="F2F2F2"/>
           </w:tcPr>
           <w:p>
@@ -1181,13 +1385,13 @@
                 <w:b/>
                 <w:sz w:val="20"/>
               </w:rPr>
-              <w:t>0.019*</w:t>
+              <w:t>0.026*</w:t>
             </w:r>
           </w:p>
         </w:tc>
         <w:tc>
           <w:tcPr>
-            <w:tcW w:type="dxa" w:w="1296"/>
+            <w:tcW w:type="dxa" w:w="1080"/>
             <w:shd w:val="clear" w:color="auto" w:fill="F2F2F2"/>
           </w:tcPr>
           <w:p>
@@ -1201,13 +1405,33 @@
                 <w:b w:val="0"/>
                 <w:sz w:val="20"/>
               </w:rPr>
-              <w:t>2.77</w:t>
+              <w:t>81</w:t>
             </w:r>
           </w:p>
         </w:tc>
         <w:tc>
           <w:tcPr>
-            <w:tcW w:type="dxa" w:w="1296"/>
+            <w:tcW w:type="dxa" w:w="1080"/>
+            <w:shd w:val="clear" w:color="auto" w:fill="F2F2F2"/>
+          </w:tcPr>
+          <w:p>
+            <w:pPr>
+              <w:jc w:val="right"/>
+            </w:pPr>
+            <w:r/>
+            <w:r>
+              <w:rPr>
+                <w:rFonts w:ascii="Times New Roman" w:hAnsi="Times New Roman"/>
+                <w:b w:val="0"/>
+                <w:sz w:val="20"/>
+              </w:rPr>
+              <w:t>2.54</w:t>
+            </w:r>
+          </w:p>
+        </w:tc>
+        <w:tc>
+          <w:tcPr>
+            <w:tcW w:type="dxa" w:w="1080"/>
             <w:shd w:val="clear" w:color="auto" w:fill="F2F2F2"/>
           </w:tcPr>
           <w:p>
@@ -1221,13 +1445,13 @@
                 <w:b/>
                 <w:sz w:val="20"/>
               </w:rPr>
-              <w:t>0.004**</w:t>
+              <w:t>0.007**</w:t>
             </w:r>
           </w:p>
         </w:tc>
         <w:tc>
           <w:tcPr>
-            <w:tcW w:type="dxa" w:w="1296"/>
+            <w:tcW w:type="dxa" w:w="1080"/>
             <w:shd w:val="clear" w:color="auto" w:fill="F2F2F2"/>
           </w:tcPr>
           <w:p>
@@ -1241,13 +1465,33 @@
                 <w:b w:val="0"/>
                 <w:sz w:val="20"/>
               </w:rPr>
-              <w:t>2.29</w:t>
+              <w:t>81</w:t>
             </w:r>
           </w:p>
         </w:tc>
         <w:tc>
           <w:tcPr>
-            <w:tcW w:type="dxa" w:w="1296"/>
+            <w:tcW w:type="dxa" w:w="1080"/>
+            <w:shd w:val="clear" w:color="auto" w:fill="F2F2F2"/>
+          </w:tcPr>
+          <w:p>
+            <w:pPr>
+              <w:jc w:val="right"/>
+            </w:pPr>
+            <w:r/>
+            <w:r>
+              <w:rPr>
+                <w:rFonts w:ascii="Times New Roman" w:hAnsi="Times New Roman"/>
+                <w:b w:val="0"/>
+                <w:sz w:val="20"/>
+              </w:rPr>
+              <w:t>2.05</w:t>
+            </w:r>
+          </w:p>
+        </w:tc>
+        <w:tc>
+          <w:tcPr>
+            <w:tcW w:type="dxa" w:w="1080"/>
             <w:shd w:val="clear" w:color="auto" w:fill="F2F2F2"/>
           </w:tcPr>
           <w:p>
@@ -1261,7 +1505,7 @@
                 <w:b/>
                 <w:sz w:val="20"/>
               </w:rPr>
-              <w:t>0.011*</w:t>
+              <w:t>0.020*</w:t>
             </w:r>
           </w:p>
         </w:tc>
@@ -1269,7 +1513,7 @@
       <w:tr>
         <w:tc>
           <w:tcPr>
-            <w:tcW w:type="dxa" w:w="1296"/>
+            <w:tcW w:type="dxa" w:w="1080"/>
             <w:shd w:val="clear" w:color="auto" w:fill="FFFFFF"/>
           </w:tcPr>
           <w:p>
@@ -1289,7 +1533,7 @@
         </w:tc>
         <w:tc>
           <w:tcPr>
-            <w:tcW w:type="dxa" w:w="1296"/>
+            <w:tcW w:type="dxa" w:w="1080"/>
             <w:shd w:val="clear" w:color="auto" w:fill="FFFFFF"/>
           </w:tcPr>
           <w:p>
@@ -1309,7 +1553,7 @@
         </w:tc>
         <w:tc>
           <w:tcPr>
-            <w:tcW w:type="dxa" w:w="1296"/>
+            <w:tcW w:type="dxa" w:w="1080"/>
             <w:shd w:val="clear" w:color="auto" w:fill="FFFFFF"/>
           </w:tcPr>
           <w:p>
@@ -1329,7 +1573,7 @@
         </w:tc>
         <w:tc>
           <w:tcPr>
-            <w:tcW w:type="dxa" w:w="1296"/>
+            <w:tcW w:type="dxa" w:w="1080"/>
             <w:shd w:val="clear" w:color="auto" w:fill="FFFFFF"/>
           </w:tcPr>
           <w:p>
@@ -1343,13 +1587,13 @@
                 <w:b w:val="0"/>
                 <w:sz w:val="20"/>
               </w:rPr>
-              <w:t>80</w:t>
+              <w:t>81</w:t>
             </w:r>
           </w:p>
         </w:tc>
         <w:tc>
           <w:tcPr>
-            <w:tcW w:type="dxa" w:w="1296"/>
+            <w:tcW w:type="dxa" w:w="1080"/>
             <w:shd w:val="clear" w:color="auto" w:fill="FFFFFF"/>
           </w:tcPr>
           <w:p>
@@ -1363,53 +1607,13 @@
                 <w:b w:val="0"/>
                 <w:sz w:val="20"/>
               </w:rPr>
-              <w:t>0.134</w:t>
+              <w:t>0.189</w:t>
             </w:r>
           </w:p>
         </w:tc>
         <w:tc>
           <w:tcPr>
-            <w:tcW w:type="dxa" w:w="1296"/>
-            <w:shd w:val="clear" w:color="auto" w:fill="FFFFFF"/>
-          </w:tcPr>
-          <w:p>
-            <w:pPr>
-              <w:jc w:val="right"/>
-            </w:pPr>
-            <w:r/>
-            <w:r>
-              <w:rPr>
-                <w:rFonts w:ascii="Times New Roman" w:hAnsi="Times New Roman"/>
-                <w:b w:val="0"/>
-                <w:sz w:val="20"/>
-              </w:rPr>
-              <w:t>0.118</w:t>
-            </w:r>
-          </w:p>
-        </w:tc>
-        <w:tc>
-          <w:tcPr>
-            <w:tcW w:type="dxa" w:w="1296"/>
-            <w:shd w:val="clear" w:color="auto" w:fill="FFFFFF"/>
-          </w:tcPr>
-          <w:p>
-            <w:pPr>
-              <w:jc w:val="right"/>
-            </w:pPr>
-            <w:r/>
-            <w:r>
-              <w:rPr>
-                <w:rFonts w:ascii="Times New Roman" w:hAnsi="Times New Roman"/>
-                <w:b w:val="0"/>
-                <w:sz w:val="20"/>
-              </w:rPr>
-              <w:t>1.71</w:t>
-            </w:r>
-          </w:p>
-        </w:tc>
-        <w:tc>
-          <w:tcPr>
-            <w:tcW w:type="dxa" w:w="1296"/>
+            <w:tcW w:type="dxa" w:w="1080"/>
             <w:shd w:val="clear" w:color="auto" w:fill="FFFFFF"/>
           </w:tcPr>
           <w:p>
@@ -1429,7 +1633,7 @@
         </w:tc>
         <w:tc>
           <w:tcPr>
-            <w:tcW w:type="dxa" w:w="1296"/>
+            <w:tcW w:type="dxa" w:w="1080"/>
             <w:shd w:val="clear" w:color="auto" w:fill="FFFFFF"/>
           </w:tcPr>
           <w:p>
@@ -1443,13 +1647,13 @@
                 <w:b w:val="0"/>
                 <w:sz w:val="20"/>
               </w:rPr>
-              <w:t>1.36</w:t>
+              <w:t>81</w:t>
             </w:r>
           </w:p>
         </w:tc>
         <w:tc>
           <w:tcPr>
-            <w:tcW w:type="dxa" w:w="1296"/>
+            <w:tcW w:type="dxa" w:w="1080"/>
             <w:shd w:val="clear" w:color="auto" w:fill="FFFFFF"/>
           </w:tcPr>
           <w:p>
@@ -1463,358 +1667,14 @@
                 <w:b w:val="0"/>
                 <w:sz w:val="20"/>
               </w:rPr>
-              <w:t>0.088</w:t>
-            </w:r>
-          </w:p>
-        </w:tc>
-      </w:tr>
-      <w:tr>
-        <w:tc>
-          <w:tcPr>
-            <w:tcW w:type="dxa" w:w="1296"/>
-            <w:shd w:val="clear" w:color="auto" w:fill="D9D9D9"/>
-          </w:tcPr>
-          <w:p>
-            <w:pPr>
-              <w:jc w:val="left"/>
-            </w:pPr>
-            <w:r/>
-            <w:r>
-              <w:rPr>
-                <w:rFonts w:ascii="Times New Roman" w:hAnsi="Times New Roman"/>
-                <w:b w:val="0"/>
-                <w:sz w:val="20"/>
-              </w:rPr>
-              <w:t>Analysis 03: Age -&gt; Persistence</w:t>
+              <w:t>1.99</w:t>
             </w:r>
           </w:p>
         </w:tc>
         <w:tc>
           <w:tcPr>
-            <w:tcW w:type="dxa" w:w="1296"/>
-            <w:shd w:val="clear" w:color="auto" w:fill="D9D9D9"/>
-          </w:tcPr>
-          <w:p>
-            <w:pPr>
-              <w:jc w:val="left"/>
-            </w:pPr>
-            <w:r/>
-            <w:r>
-              <w:rPr>
-                <w:rFonts w:ascii="Times New Roman" w:hAnsi="Times New Roman"/>
-                <w:b w:val="0"/>
-                <w:sz w:val="20"/>
-              </w:rPr>
-              <w:t>Age (Project 5)</w:t>
-            </w:r>
-          </w:p>
-        </w:tc>
-        <w:tc>
-          <w:tcPr>
-            <w:tcW w:type="dxa" w:w="1296"/>
-            <w:shd w:val="clear" w:color="auto" w:fill="D9D9D9"/>
-          </w:tcPr>
-          <w:p>
-            <w:pPr>
-              <w:jc w:val="left"/>
-            </w:pPr>
-            <w:r/>
-            <w:r>
-              <w:rPr>
-                <w:rFonts w:ascii="Times New Roman" w:hAnsi="Times New Roman"/>
-                <w:b w:val="0"/>
-                <w:sz w:val="20"/>
-              </w:rPr>
-              <w:t>Neg. persistence, left amygdala</w:t>
-            </w:r>
-          </w:p>
-        </w:tc>
-        <w:tc>
-          <w:tcPr>
-            <w:tcW w:type="dxa" w:w="1296"/>
-            <w:shd w:val="clear" w:color="auto" w:fill="D9D9D9"/>
-          </w:tcPr>
-          <w:p>
-            <w:pPr>
-              <w:jc w:val="right"/>
-            </w:pPr>
-            <w:r/>
-            <w:r>
-              <w:rPr>
-                <w:rFonts w:ascii="Times New Roman" w:hAnsi="Times New Roman"/>
-                <w:b w:val="0"/>
-                <w:sz w:val="20"/>
-              </w:rPr>
-              <w:t>128</w:t>
-            </w:r>
-          </w:p>
-        </w:tc>
-        <w:tc>
-          <w:tcPr>
-            <w:tcW w:type="dxa" w:w="1296"/>
-            <w:shd w:val="clear" w:color="auto" w:fill="D9D9D9"/>
-          </w:tcPr>
-          <w:p>
-            <w:pPr>
-              <w:jc w:val="right"/>
-            </w:pPr>
-            <w:r/>
-            <w:r>
-              <w:rPr>
-                <w:rFonts w:ascii="Times New Roman" w:hAnsi="Times New Roman"/>
-                <w:b w:val="0"/>
-                <w:sz w:val="20"/>
-              </w:rPr>
-              <w:t>-0.114</w:t>
-            </w:r>
-          </w:p>
-        </w:tc>
-        <w:tc>
-          <w:tcPr>
-            <w:tcW w:type="dxa" w:w="1296"/>
-            <w:shd w:val="clear" w:color="auto" w:fill="D9D9D9"/>
-          </w:tcPr>
-          <w:p>
-            <w:pPr>
-              <w:jc w:val="right"/>
-            </w:pPr>
-            <w:r/>
-            <w:r>
-              <w:rPr>
-                <w:rFonts w:ascii="Times New Roman" w:hAnsi="Times New Roman"/>
-                <w:b w:val="0"/>
-                <w:sz w:val="20"/>
-              </w:rPr>
-              <w:t>0.100</w:t>
-            </w:r>
-          </w:p>
-        </w:tc>
-        <w:tc>
-          <w:tcPr>
-            <w:tcW w:type="dxa" w:w="1296"/>
-            <w:shd w:val="clear" w:color="auto" w:fill="D9D9D9"/>
-          </w:tcPr>
-          <w:p>
-            <w:pPr>
-              <w:jc w:val="right"/>
-            </w:pPr>
-            <w:r/>
-            <w:r>
-              <w:rPr>
-                <w:rFonts w:ascii="Times New Roman" w:hAnsi="Times New Roman"/>
-                <w:b w:val="0"/>
-                <w:sz w:val="20"/>
-              </w:rPr>
-              <w:t>-0.37</w:t>
-            </w:r>
-          </w:p>
-        </w:tc>
-        <w:tc>
-          <w:tcPr>
-            <w:tcW w:type="dxa" w:w="1296"/>
-            <w:shd w:val="clear" w:color="auto" w:fill="D9D9D9"/>
-          </w:tcPr>
-          <w:p>
-            <w:pPr>
-              <w:jc w:val="right"/>
-            </w:pPr>
-            <w:r/>
-            <w:r>
-              <w:rPr>
-                <w:rFonts w:ascii="Times New Roman" w:hAnsi="Times New Roman"/>
-                <w:b w:val="0"/>
-                <w:sz w:val="20"/>
-              </w:rPr>
-              <w:t>0.357</w:t>
-            </w:r>
-          </w:p>
-        </w:tc>
-        <w:tc>
-          <w:tcPr>
-            <w:tcW w:type="dxa" w:w="1296"/>
-            <w:shd w:val="clear" w:color="auto" w:fill="D9D9D9"/>
-          </w:tcPr>
-          <w:p>
-            <w:pPr>
-              <w:jc w:val="right"/>
-            </w:pPr>
-            <w:r/>
-            <w:r>
-              <w:rPr>
-                <w:rFonts w:ascii="Times New Roman" w:hAnsi="Times New Roman"/>
-                <w:b w:val="0"/>
-                <w:sz w:val="20"/>
-              </w:rPr>
-              <w:t>-1.23</w:t>
-            </w:r>
-          </w:p>
-        </w:tc>
-        <w:tc>
-          <w:tcPr>
-            <w:tcW w:type="dxa" w:w="1296"/>
-            <w:shd w:val="clear" w:color="auto" w:fill="D9D9D9"/>
-          </w:tcPr>
-          <w:p>
-            <w:pPr>
-              <w:jc w:val="right"/>
-            </w:pPr>
-            <w:r/>
-            <w:r>
-              <w:rPr>
-                <w:rFonts w:ascii="Times New Roman" w:hAnsi="Times New Roman"/>
-                <w:b w:val="0"/>
-                <w:sz w:val="20"/>
-              </w:rPr>
-              <w:t>0.110</w:t>
-            </w:r>
-          </w:p>
-        </w:tc>
-      </w:tr>
-      <w:tr>
-        <w:tc>
-          <w:tcPr>
-            <w:tcW w:type="dxa" w:w="1296"/>
-            <w:shd w:val="clear" w:color="auto" w:fill="D9D9D9"/>
-          </w:tcPr>
-          <w:p>
-            <w:pPr>
-              <w:jc w:val="left"/>
-            </w:pPr>
-            <w:r/>
-            <w:r>
-              <w:rPr>
-                <w:rFonts w:ascii="Times New Roman" w:hAnsi="Times New Roman"/>
-                <w:b w:val="0"/>
-                <w:sz w:val="20"/>
-              </w:rPr>
-              <w:t>Analysis 04: FC -&gt; Daily Affect</w:t>
-            </w:r>
-          </w:p>
-        </w:tc>
-        <w:tc>
-          <w:tcPr>
-            <w:tcW w:type="dxa" w:w="1296"/>
-            <w:shd w:val="clear" w:color="auto" w:fill="D9D9D9"/>
-          </w:tcPr>
-          <w:p>
-            <w:pPr>
-              <w:jc w:val="left"/>
-            </w:pPr>
-            <w:r/>
-            <w:r>
-              <w:rPr>
-                <w:rFonts w:ascii="Times New Roman" w:hAnsi="Times New Roman"/>
-                <w:b w:val="0"/>
-                <w:sz w:val="20"/>
-              </w:rPr>
-              <w:t>Left amygdala-ant. vmPFC FC</w:t>
-            </w:r>
-          </w:p>
-        </w:tc>
-        <w:tc>
-          <w:tcPr>
-            <w:tcW w:type="dxa" w:w="1296"/>
-            <w:shd w:val="clear" w:color="auto" w:fill="D9D9D9"/>
-          </w:tcPr>
-          <w:p>
-            <w:pPr>
-              <w:jc w:val="left"/>
-            </w:pPr>
-            <w:r/>
-            <w:r>
-              <w:rPr>
-                <w:rFonts w:ascii="Times New Roman" w:hAnsi="Times New Roman"/>
-                <w:b w:val="0"/>
-                <w:sz w:val="20"/>
-              </w:rPr>
-              <w:t>Positive affect (diary)</w:t>
-            </w:r>
-          </w:p>
-        </w:tc>
-        <w:tc>
-          <w:tcPr>
-            <w:tcW w:type="dxa" w:w="1296"/>
-            <w:shd w:val="clear" w:color="auto" w:fill="D9D9D9"/>
-          </w:tcPr>
-          <w:p>
-            <w:pPr>
-              <w:jc w:val="right"/>
-            </w:pPr>
-            <w:r/>
-            <w:r>
-              <w:rPr>
-                <w:rFonts w:ascii="Times New Roman" w:hAnsi="Times New Roman"/>
-                <w:b w:val="0"/>
-                <w:sz w:val="20"/>
-              </w:rPr>
-              <w:t>80</w:t>
-            </w:r>
-          </w:p>
-        </w:tc>
-        <w:tc>
-          <w:tcPr>
-            <w:tcW w:type="dxa" w:w="1296"/>
-            <w:shd w:val="clear" w:color="auto" w:fill="D9D9D9"/>
-          </w:tcPr>
-          <w:p>
-            <w:pPr>
-              <w:jc w:val="right"/>
-            </w:pPr>
-            <w:r/>
-            <w:r>
-              <w:rPr>
-                <w:rFonts w:ascii="Times New Roman" w:hAnsi="Times New Roman"/>
-                <w:b w:val="0"/>
-                <w:sz w:val="20"/>
-              </w:rPr>
-              <w:t>0.157</w:t>
-            </w:r>
-          </w:p>
-        </w:tc>
-        <w:tc>
-          <w:tcPr>
-            <w:tcW w:type="dxa" w:w="1296"/>
-            <w:shd w:val="clear" w:color="auto" w:fill="D9D9D9"/>
-          </w:tcPr>
-          <w:p>
-            <w:pPr>
-              <w:jc w:val="right"/>
-            </w:pPr>
-            <w:r/>
-            <w:r>
-              <w:rPr>
-                <w:rFonts w:ascii="Times New Roman" w:hAnsi="Times New Roman"/>
-                <w:b w:val="0"/>
-                <w:sz w:val="20"/>
-              </w:rPr>
-              <w:t>0.083</w:t>
-            </w:r>
-          </w:p>
-        </w:tc>
-        <w:tc>
-          <w:tcPr>
-            <w:tcW w:type="dxa" w:w="1296"/>
-            <w:shd w:val="clear" w:color="auto" w:fill="D9D9D9"/>
-          </w:tcPr>
-          <w:p>
-            <w:pPr>
-              <w:jc w:val="right"/>
-            </w:pPr>
-            <w:r/>
-            <w:r>
-              <w:rPr>
-                <w:rFonts w:ascii="Times New Roman" w:hAnsi="Times New Roman"/>
-                <w:b w:val="0"/>
-                <w:sz w:val="20"/>
-              </w:rPr>
-              <w:t>2.17</w:t>
-            </w:r>
-          </w:p>
-        </w:tc>
-        <w:tc>
-          <w:tcPr>
-            <w:tcW w:type="dxa" w:w="1296"/>
-            <w:shd w:val="clear" w:color="auto" w:fill="D9D9D9"/>
+            <w:tcW w:type="dxa" w:w="1080"/>
+            <w:shd w:val="clear" w:color="auto" w:fill="FFFFFF"/>
           </w:tcPr>
           <w:p>
             <w:pPr>
@@ -1827,317 +1687,13 @@
                 <w:b/>
                 <w:sz w:val="20"/>
               </w:rPr>
-              <w:t>0.017*</w:t>
+              <w:t>0.025*</w:t>
             </w:r>
           </w:p>
         </w:tc>
         <w:tc>
           <w:tcPr>
-            <w:tcW w:type="dxa" w:w="1296"/>
-            <w:shd w:val="clear" w:color="auto" w:fill="D9D9D9"/>
-          </w:tcPr>
-          <w:p>
-            <w:pPr>
-              <w:jc w:val="right"/>
-            </w:pPr>
-            <w:r/>
-            <w:r>
-              <w:rPr>
-                <w:rFonts w:ascii="Times New Roman" w:hAnsi="Times New Roman"/>
-                <w:b w:val="0"/>
-                <w:sz w:val="20"/>
-              </w:rPr>
-              <w:t>1.51</w:t>
-            </w:r>
-          </w:p>
-        </w:tc>
-        <w:tc>
-          <w:tcPr>
-            <w:tcW w:type="dxa" w:w="1296"/>
-            <w:shd w:val="clear" w:color="auto" w:fill="D9D9D9"/>
-          </w:tcPr>
-          <w:p>
-            <w:pPr>
-              <w:jc w:val="right"/>
-            </w:pPr>
-            <w:r/>
-            <w:r>
-              <w:rPr>
-                <w:rFonts w:ascii="Times New Roman" w:hAnsi="Times New Roman"/>
-                <w:b w:val="0"/>
-                <w:sz w:val="20"/>
-              </w:rPr>
-              <w:t>0.066</w:t>
-            </w:r>
-          </w:p>
-        </w:tc>
-      </w:tr>
-      <w:tr>
-        <w:tc>
-          <w:tcPr>
-            <w:tcW w:type="dxa" w:w="1296"/>
-            <w:shd w:val="clear" w:color="auto" w:fill="F2F2F2"/>
-          </w:tcPr>
-          <w:p>
-            <w:pPr>
-              <w:jc w:val="left"/>
-            </w:pPr>
-            <w:r/>
-            <w:r>
-              <w:rPr>
-                <w:rFonts w:ascii="Times New Roman" w:hAnsi="Times New Roman"/>
-                <w:b w:val="0"/>
-                <w:sz w:val="20"/>
-              </w:rPr>
-              <w:t>Analysis 04: FC -&gt; Daily Affect</w:t>
-            </w:r>
-          </w:p>
-        </w:tc>
-        <w:tc>
-          <w:tcPr>
-            <w:tcW w:type="dxa" w:w="1296"/>
-            <w:shd w:val="clear" w:color="auto" w:fill="F2F2F2"/>
-          </w:tcPr>
-          <w:p>
-            <w:pPr>
-              <w:jc w:val="left"/>
-            </w:pPr>
-            <w:r/>
-            <w:r>
-              <w:rPr>
-                <w:rFonts w:ascii="Times New Roman" w:hAnsi="Times New Roman"/>
-                <w:b w:val="0"/>
-                <w:sz w:val="20"/>
-              </w:rPr>
-              <w:t>Left amygdala-ant. vmPFC FC</w:t>
-            </w:r>
-          </w:p>
-        </w:tc>
-        <w:tc>
-          <w:tcPr>
-            <w:tcW w:type="dxa" w:w="1296"/>
-            <w:shd w:val="clear" w:color="auto" w:fill="F2F2F2"/>
-          </w:tcPr>
-          <w:p>
-            <w:pPr>
-              <w:jc w:val="left"/>
-            </w:pPr>
-            <w:r/>
-            <w:r>
-              <w:rPr>
-                <w:rFonts w:ascii="Times New Roman" w:hAnsi="Times New Roman"/>
-                <w:b w:val="0"/>
-                <w:sz w:val="20"/>
-              </w:rPr>
-              <w:t>Negative affect (diary)</w:t>
-            </w:r>
-          </w:p>
-        </w:tc>
-        <w:tc>
-          <w:tcPr>
-            <w:tcW w:type="dxa" w:w="1296"/>
-            <w:shd w:val="clear" w:color="auto" w:fill="F2F2F2"/>
-          </w:tcPr>
-          <w:p>
-            <w:pPr>
-              <w:jc w:val="right"/>
-            </w:pPr>
-            <w:r/>
-            <w:r>
-              <w:rPr>
-                <w:rFonts w:ascii="Times New Roman" w:hAnsi="Times New Roman"/>
-                <w:b w:val="0"/>
-                <w:sz w:val="20"/>
-              </w:rPr>
-              <w:t>80</w:t>
-            </w:r>
-          </w:p>
-        </w:tc>
-        <w:tc>
-          <w:tcPr>
-            <w:tcW w:type="dxa" w:w="1296"/>
-            <w:shd w:val="clear" w:color="auto" w:fill="F2F2F2"/>
-          </w:tcPr>
-          <w:p>
-            <w:pPr>
-              <w:jc w:val="right"/>
-            </w:pPr>
-            <w:r/>
-            <w:r>
-              <w:rPr>
-                <w:rFonts w:ascii="Times New Roman" w:hAnsi="Times New Roman"/>
-                <w:b w:val="0"/>
-                <w:sz w:val="20"/>
-              </w:rPr>
-              <w:t>-0.186</w:t>
-            </w:r>
-          </w:p>
-        </w:tc>
-        <w:tc>
-          <w:tcPr>
-            <w:tcW w:type="dxa" w:w="1296"/>
-            <w:shd w:val="clear" w:color="auto" w:fill="F2F2F2"/>
-          </w:tcPr>
-          <w:p>
-            <w:pPr>
-              <w:jc w:val="right"/>
-            </w:pPr>
-            <w:r/>
-            <w:r>
-              <w:rPr>
-                <w:rFonts w:ascii="Times New Roman" w:hAnsi="Times New Roman"/>
-                <w:b/>
-                <w:sz w:val="20"/>
-              </w:rPr>
-              <w:t>0.050*</w:t>
-            </w:r>
-          </w:p>
-        </w:tc>
-        <w:tc>
-          <w:tcPr>
-            <w:tcW w:type="dxa" w:w="1296"/>
-            <w:shd w:val="clear" w:color="auto" w:fill="F2F2F2"/>
-          </w:tcPr>
-          <w:p>
-            <w:pPr>
-              <w:jc w:val="right"/>
-            </w:pPr>
-            <w:r/>
-            <w:r>
-              <w:rPr>
-                <w:rFonts w:ascii="Times New Roman" w:hAnsi="Times New Roman"/>
-                <w:b w:val="0"/>
-                <w:sz w:val="20"/>
-              </w:rPr>
-              <w:t>-1.68</w:t>
-            </w:r>
-          </w:p>
-        </w:tc>
-        <w:tc>
-          <w:tcPr>
-            <w:tcW w:type="dxa" w:w="1296"/>
-            <w:shd w:val="clear" w:color="auto" w:fill="F2F2F2"/>
-          </w:tcPr>
-          <w:p>
-            <w:pPr>
-              <w:jc w:val="right"/>
-            </w:pPr>
-            <w:r/>
-            <w:r>
-              <w:rPr>
-                <w:rFonts w:ascii="Times New Roman" w:hAnsi="Times New Roman"/>
-                <w:b/>
-                <w:sz w:val="20"/>
-              </w:rPr>
-              <w:t>0.049*</w:t>
-            </w:r>
-          </w:p>
-        </w:tc>
-        <w:tc>
-          <w:tcPr>
-            <w:tcW w:type="dxa" w:w="1296"/>
-            <w:shd w:val="clear" w:color="auto" w:fill="F2F2F2"/>
-          </w:tcPr>
-          <w:p>
-            <w:pPr>
-              <w:jc w:val="right"/>
-            </w:pPr>
-            <w:r/>
-            <w:r>
-              <w:rPr>
-                <w:rFonts w:ascii="Times New Roman" w:hAnsi="Times New Roman"/>
-                <w:b w:val="0"/>
-                <w:sz w:val="20"/>
-              </w:rPr>
-              <w:t>-2.89</w:t>
-            </w:r>
-          </w:p>
-        </w:tc>
-        <w:tc>
-          <w:tcPr>
-            <w:tcW w:type="dxa" w:w="1296"/>
-            <w:shd w:val="clear" w:color="auto" w:fill="F2F2F2"/>
-          </w:tcPr>
-          <w:p>
-            <w:pPr>
-              <w:jc w:val="right"/>
-            </w:pPr>
-            <w:r/>
-            <w:r>
-              <w:rPr>
-                <w:rFonts w:ascii="Times New Roman" w:hAnsi="Times New Roman"/>
-                <w:b/>
-                <w:sz w:val="20"/>
-              </w:rPr>
-              <w:t>0.002**</w:t>
-            </w:r>
-          </w:p>
-        </w:tc>
-      </w:tr>
-      <w:tr>
-        <w:tc>
-          <w:tcPr>
-            <w:tcW w:type="dxa" w:w="1296"/>
-            <w:shd w:val="clear" w:color="auto" w:fill="FFFFFF"/>
-          </w:tcPr>
-          <w:p>
-            <w:pPr>
-              <w:jc w:val="left"/>
-            </w:pPr>
-            <w:r/>
-            <w:r>
-              <w:rPr>
-                <w:rFonts w:ascii="Times New Roman" w:hAnsi="Times New Roman"/>
-                <w:b w:val="0"/>
-                <w:sz w:val="20"/>
-              </w:rPr>
-              <w:t>Analysis 04: FC -&gt; Daily Affect</w:t>
-            </w:r>
-          </w:p>
-        </w:tc>
-        <w:tc>
-          <w:tcPr>
-            <w:tcW w:type="dxa" w:w="1296"/>
-            <w:shd w:val="clear" w:color="auto" w:fill="FFFFFF"/>
-          </w:tcPr>
-          <w:p>
-            <w:pPr>
-              <w:jc w:val="left"/>
-            </w:pPr>
-            <w:r/>
-            <w:r>
-              <w:rPr>
-                <w:rFonts w:ascii="Times New Roman" w:hAnsi="Times New Roman"/>
-                <w:b w:val="0"/>
-                <w:sz w:val="20"/>
-              </w:rPr>
-              <w:t>Left amygdala-ant. vmPFC FC</w:t>
-            </w:r>
-          </w:p>
-        </w:tc>
-        <w:tc>
-          <w:tcPr>
-            <w:tcW w:type="dxa" w:w="1296"/>
-            <w:shd w:val="clear" w:color="auto" w:fill="FFFFFF"/>
-          </w:tcPr>
-          <w:p>
-            <w:pPr>
-              <w:jc w:val="left"/>
-            </w:pPr>
-            <w:r/>
-            <w:r>
-              <w:rPr>
-                <w:rFonts w:ascii="Times New Roman" w:hAnsi="Times New Roman"/>
-                <w:b w:val="0"/>
-                <w:sz w:val="20"/>
-              </w:rPr>
-              <w:t>Negative affect, log (diary)</w:t>
-            </w:r>
-          </w:p>
-        </w:tc>
-        <w:tc>
-          <w:tcPr>
-            <w:tcW w:type="dxa" w:w="1296"/>
+            <w:tcW w:type="dxa" w:w="1080"/>
             <w:shd w:val="clear" w:color="auto" w:fill="FFFFFF"/>
           </w:tcPr>
           <w:p>
@@ -2151,13 +1707,13 @@
                 <w:b w:val="0"/>
                 <w:sz w:val="20"/>
               </w:rPr>
-              <w:t>80</w:t>
+              <w:t>81</w:t>
             </w:r>
           </w:p>
         </w:tc>
         <w:tc>
           <w:tcPr>
-            <w:tcW w:type="dxa" w:w="1296"/>
+            <w:tcW w:type="dxa" w:w="1080"/>
             <w:shd w:val="clear" w:color="auto" w:fill="FFFFFF"/>
           </w:tcPr>
           <w:p>
@@ -2171,700 +1727,14 @@
                 <w:b w:val="0"/>
                 <w:sz w:val="20"/>
               </w:rPr>
-              <w:t>-0.204</w:t>
+              <w:t>1.53</w:t>
             </w:r>
           </w:p>
         </w:tc>
         <w:tc>
           <w:tcPr>
-            <w:tcW w:type="dxa" w:w="1296"/>
+            <w:tcW w:type="dxa" w:w="1080"/>
             <w:shd w:val="clear" w:color="auto" w:fill="FFFFFF"/>
-          </w:tcPr>
-          <w:p>
-            <w:pPr>
-              <w:jc w:val="right"/>
-            </w:pPr>
-            <w:r/>
-            <w:r>
-              <w:rPr>
-                <w:rFonts w:ascii="Times New Roman" w:hAnsi="Times New Roman"/>
-                <w:b/>
-                <w:sz w:val="20"/>
-              </w:rPr>
-              <w:t>0.034*</w:t>
-            </w:r>
-          </w:p>
-        </w:tc>
-        <w:tc>
-          <w:tcPr>
-            <w:tcW w:type="dxa" w:w="1296"/>
-            <w:shd w:val="clear" w:color="auto" w:fill="FFFFFF"/>
-          </w:tcPr>
-          <w:p>
-            <w:pPr>
-              <w:jc w:val="right"/>
-            </w:pPr>
-            <w:r/>
-            <w:r>
-              <w:rPr>
-                <w:rFonts w:ascii="Times New Roman" w:hAnsi="Times New Roman"/>
-                <w:b w:val="0"/>
-                <w:sz w:val="20"/>
-              </w:rPr>
-              <w:t>-1.73</w:t>
-            </w:r>
-          </w:p>
-        </w:tc>
-        <w:tc>
-          <w:tcPr>
-            <w:tcW w:type="dxa" w:w="1296"/>
-            <w:shd w:val="clear" w:color="auto" w:fill="FFFFFF"/>
-          </w:tcPr>
-          <w:p>
-            <w:pPr>
-              <w:jc w:val="right"/>
-            </w:pPr>
-            <w:r/>
-            <w:r>
-              <w:rPr>
-                <w:rFonts w:ascii="Times New Roman" w:hAnsi="Times New Roman"/>
-                <w:b/>
-                <w:sz w:val="20"/>
-              </w:rPr>
-              <w:t>0.045*</w:t>
-            </w:r>
-          </w:p>
-        </w:tc>
-        <w:tc>
-          <w:tcPr>
-            <w:tcW w:type="dxa" w:w="1296"/>
-            <w:shd w:val="clear" w:color="auto" w:fill="FFFFFF"/>
-          </w:tcPr>
-          <w:p>
-            <w:pPr>
-              <w:jc w:val="right"/>
-            </w:pPr>
-            <w:r/>
-            <w:r>
-              <w:rPr>
-                <w:rFonts w:ascii="Times New Roman" w:hAnsi="Times New Roman"/>
-                <w:b w:val="0"/>
-                <w:sz w:val="20"/>
-              </w:rPr>
-              <w:t>-1.94</w:t>
-            </w:r>
-          </w:p>
-        </w:tc>
-        <w:tc>
-          <w:tcPr>
-            <w:tcW w:type="dxa" w:w="1296"/>
-            <w:shd w:val="clear" w:color="auto" w:fill="FFFFFF"/>
-          </w:tcPr>
-          <w:p>
-            <w:pPr>
-              <w:jc w:val="right"/>
-            </w:pPr>
-            <w:r/>
-            <w:r>
-              <w:rPr>
-                <w:rFonts w:ascii="Times New Roman" w:hAnsi="Times New Roman"/>
-                <w:b/>
-                <w:sz w:val="20"/>
-              </w:rPr>
-              <w:t>0.026*</w:t>
-            </w:r>
-          </w:p>
-        </w:tc>
-      </w:tr>
-      <w:tr>
-        <w:tc>
-          <w:tcPr>
-            <w:tcW w:type="dxa" w:w="1296"/>
-            <w:shd w:val="clear" w:color="auto" w:fill="F2F2F2"/>
-          </w:tcPr>
-          <w:p>
-            <w:pPr>
-              <w:jc w:val="left"/>
-            </w:pPr>
-            <w:r/>
-            <w:r>
-              <w:rPr>
-                <w:rFonts w:ascii="Times New Roman" w:hAnsi="Times New Roman"/>
-                <w:b w:val="0"/>
-                <w:sz w:val="20"/>
-              </w:rPr>
-              <w:t>Analysis 04: FC -&gt; Daily Affect</w:t>
-            </w:r>
-          </w:p>
-        </w:tc>
-        <w:tc>
-          <w:tcPr>
-            <w:tcW w:type="dxa" w:w="1296"/>
-            <w:shd w:val="clear" w:color="auto" w:fill="F2F2F2"/>
-          </w:tcPr>
-          <w:p>
-            <w:pPr>
-              <w:jc w:val="left"/>
-            </w:pPr>
-            <w:r/>
-            <w:r>
-              <w:rPr>
-                <w:rFonts w:ascii="Times New Roman" w:hAnsi="Times New Roman"/>
-                <w:b w:val="0"/>
-                <w:sz w:val="20"/>
-              </w:rPr>
-              <w:t>Left amygdala-post. vmPFC FC</w:t>
-            </w:r>
-          </w:p>
-        </w:tc>
-        <w:tc>
-          <w:tcPr>
-            <w:tcW w:type="dxa" w:w="1296"/>
-            <w:shd w:val="clear" w:color="auto" w:fill="F2F2F2"/>
-          </w:tcPr>
-          <w:p>
-            <w:pPr>
-              <w:jc w:val="left"/>
-            </w:pPr>
-            <w:r/>
-            <w:r>
-              <w:rPr>
-                <w:rFonts w:ascii="Times New Roman" w:hAnsi="Times New Roman"/>
-                <w:b w:val="0"/>
-                <w:sz w:val="20"/>
-              </w:rPr>
-              <w:t>Positive affect (diary)</w:t>
-            </w:r>
-          </w:p>
-        </w:tc>
-        <w:tc>
-          <w:tcPr>
-            <w:tcW w:type="dxa" w:w="1296"/>
-            <w:shd w:val="clear" w:color="auto" w:fill="F2F2F2"/>
-          </w:tcPr>
-          <w:p>
-            <w:pPr>
-              <w:jc w:val="right"/>
-            </w:pPr>
-            <w:r/>
-            <w:r>
-              <w:rPr>
-                <w:rFonts w:ascii="Times New Roman" w:hAnsi="Times New Roman"/>
-                <w:b w:val="0"/>
-                <w:sz w:val="20"/>
-              </w:rPr>
-              <w:t>80</w:t>
-            </w:r>
-          </w:p>
-        </w:tc>
-        <w:tc>
-          <w:tcPr>
-            <w:tcW w:type="dxa" w:w="1296"/>
-            <w:shd w:val="clear" w:color="auto" w:fill="F2F2F2"/>
-          </w:tcPr>
-          <w:p>
-            <w:pPr>
-              <w:jc w:val="right"/>
-            </w:pPr>
-            <w:r/>
-            <w:r>
-              <w:rPr>
-                <w:rFonts w:ascii="Times New Roman" w:hAnsi="Times New Roman"/>
-                <w:b w:val="0"/>
-                <w:sz w:val="20"/>
-              </w:rPr>
-              <w:t>0.112</w:t>
-            </w:r>
-          </w:p>
-        </w:tc>
-        <w:tc>
-          <w:tcPr>
-            <w:tcW w:type="dxa" w:w="1296"/>
-            <w:shd w:val="clear" w:color="auto" w:fill="F2F2F2"/>
-          </w:tcPr>
-          <w:p>
-            <w:pPr>
-              <w:jc w:val="right"/>
-            </w:pPr>
-            <w:r/>
-            <w:r>
-              <w:rPr>
-                <w:rFonts w:ascii="Times New Roman" w:hAnsi="Times New Roman"/>
-                <w:b w:val="0"/>
-                <w:sz w:val="20"/>
-              </w:rPr>
-              <w:t>0.162</w:t>
-            </w:r>
-          </w:p>
-        </w:tc>
-        <w:tc>
-          <w:tcPr>
-            <w:tcW w:type="dxa" w:w="1296"/>
-            <w:shd w:val="clear" w:color="auto" w:fill="F2F2F2"/>
-          </w:tcPr>
-          <w:p>
-            <w:pPr>
-              <w:jc w:val="right"/>
-            </w:pPr>
-            <w:r/>
-            <w:r>
-              <w:rPr>
-                <w:rFonts w:ascii="Times New Roman" w:hAnsi="Times New Roman"/>
-                <w:b w:val="0"/>
-                <w:sz w:val="20"/>
-              </w:rPr>
-              <w:t>0.79</w:t>
-            </w:r>
-          </w:p>
-        </w:tc>
-        <w:tc>
-          <w:tcPr>
-            <w:tcW w:type="dxa" w:w="1296"/>
-            <w:shd w:val="clear" w:color="auto" w:fill="F2F2F2"/>
-          </w:tcPr>
-          <w:p>
-            <w:pPr>
-              <w:jc w:val="right"/>
-            </w:pPr>
-            <w:r/>
-            <w:r>
-              <w:rPr>
-                <w:rFonts w:ascii="Times New Roman" w:hAnsi="Times New Roman"/>
-                <w:b w:val="0"/>
-                <w:sz w:val="20"/>
-              </w:rPr>
-              <w:t>0.215</w:t>
-            </w:r>
-          </w:p>
-        </w:tc>
-        <w:tc>
-          <w:tcPr>
-            <w:tcW w:type="dxa" w:w="1296"/>
-            <w:shd w:val="clear" w:color="auto" w:fill="F2F2F2"/>
-          </w:tcPr>
-          <w:p>
-            <w:pPr>
-              <w:jc w:val="right"/>
-            </w:pPr>
-            <w:r/>
-            <w:r>
-              <w:rPr>
-                <w:rFonts w:ascii="Times New Roman" w:hAnsi="Times New Roman"/>
-                <w:b w:val="0"/>
-                <w:sz w:val="20"/>
-              </w:rPr>
-              <w:t>-0.79</w:t>
-            </w:r>
-          </w:p>
-        </w:tc>
-        <w:tc>
-          <w:tcPr>
-            <w:tcW w:type="dxa" w:w="1296"/>
-            <w:shd w:val="clear" w:color="auto" w:fill="F2F2F2"/>
-          </w:tcPr>
-          <w:p>
-            <w:pPr>
-              <w:jc w:val="right"/>
-            </w:pPr>
-            <w:r/>
-            <w:r>
-              <w:rPr>
-                <w:rFonts w:ascii="Times New Roman" w:hAnsi="Times New Roman"/>
-                <w:b w:val="0"/>
-                <w:sz w:val="20"/>
-              </w:rPr>
-              <w:t>0.784</w:t>
-            </w:r>
-          </w:p>
-        </w:tc>
-      </w:tr>
-      <w:tr>
-        <w:tc>
-          <w:tcPr>
-            <w:tcW w:type="dxa" w:w="1296"/>
-            <w:shd w:val="clear" w:color="auto" w:fill="FFFFFF"/>
-          </w:tcPr>
-          <w:p>
-            <w:pPr>
-              <w:jc w:val="left"/>
-            </w:pPr>
-            <w:r/>
-            <w:r>
-              <w:rPr>
-                <w:rFonts w:ascii="Times New Roman" w:hAnsi="Times New Roman"/>
-                <w:b w:val="0"/>
-                <w:sz w:val="20"/>
-              </w:rPr>
-              <w:t>Analysis 04: FC -&gt; Daily Affect</w:t>
-            </w:r>
-          </w:p>
-        </w:tc>
-        <w:tc>
-          <w:tcPr>
-            <w:tcW w:type="dxa" w:w="1296"/>
-            <w:shd w:val="clear" w:color="auto" w:fill="FFFFFF"/>
-          </w:tcPr>
-          <w:p>
-            <w:pPr>
-              <w:jc w:val="left"/>
-            </w:pPr>
-            <w:r/>
-            <w:r>
-              <w:rPr>
-                <w:rFonts w:ascii="Times New Roman" w:hAnsi="Times New Roman"/>
-                <w:b w:val="0"/>
-                <w:sz w:val="20"/>
-              </w:rPr>
-              <w:t>Left amygdala-post. vmPFC FC</w:t>
-            </w:r>
-          </w:p>
-        </w:tc>
-        <w:tc>
-          <w:tcPr>
-            <w:tcW w:type="dxa" w:w="1296"/>
-            <w:shd w:val="clear" w:color="auto" w:fill="FFFFFF"/>
-          </w:tcPr>
-          <w:p>
-            <w:pPr>
-              <w:jc w:val="left"/>
-            </w:pPr>
-            <w:r/>
-            <w:r>
-              <w:rPr>
-                <w:rFonts w:ascii="Times New Roman" w:hAnsi="Times New Roman"/>
-                <w:b w:val="0"/>
-                <w:sz w:val="20"/>
-              </w:rPr>
-              <w:t>Negative affect (diary)</w:t>
-            </w:r>
-          </w:p>
-        </w:tc>
-        <w:tc>
-          <w:tcPr>
-            <w:tcW w:type="dxa" w:w="1296"/>
-            <w:shd w:val="clear" w:color="auto" w:fill="FFFFFF"/>
-          </w:tcPr>
-          <w:p>
-            <w:pPr>
-              <w:jc w:val="right"/>
-            </w:pPr>
-            <w:r/>
-            <w:r>
-              <w:rPr>
-                <w:rFonts w:ascii="Times New Roman" w:hAnsi="Times New Roman"/>
-                <w:b w:val="0"/>
-                <w:sz w:val="20"/>
-              </w:rPr>
-              <w:t>80</w:t>
-            </w:r>
-          </w:p>
-        </w:tc>
-        <w:tc>
-          <w:tcPr>
-            <w:tcW w:type="dxa" w:w="1296"/>
-            <w:shd w:val="clear" w:color="auto" w:fill="FFFFFF"/>
-          </w:tcPr>
-          <w:p>
-            <w:pPr>
-              <w:jc w:val="right"/>
-            </w:pPr>
-            <w:r/>
-            <w:r>
-              <w:rPr>
-                <w:rFonts w:ascii="Times New Roman" w:hAnsi="Times New Roman"/>
-                <w:b w:val="0"/>
-                <w:sz w:val="20"/>
-              </w:rPr>
-              <w:t>-0.164</w:t>
-            </w:r>
-          </w:p>
-        </w:tc>
-        <w:tc>
-          <w:tcPr>
-            <w:tcW w:type="dxa" w:w="1296"/>
-            <w:shd w:val="clear" w:color="auto" w:fill="FFFFFF"/>
-          </w:tcPr>
-          <w:p>
-            <w:pPr>
-              <w:jc w:val="right"/>
-            </w:pPr>
-            <w:r/>
-            <w:r>
-              <w:rPr>
-                <w:rFonts w:ascii="Times New Roman" w:hAnsi="Times New Roman"/>
-                <w:b w:val="0"/>
-                <w:sz w:val="20"/>
-              </w:rPr>
-              <w:t>0.073</w:t>
-            </w:r>
-          </w:p>
-        </w:tc>
-        <w:tc>
-          <w:tcPr>
-            <w:tcW w:type="dxa" w:w="1296"/>
-            <w:shd w:val="clear" w:color="auto" w:fill="FFFFFF"/>
-          </w:tcPr>
-          <w:p>
-            <w:pPr>
-              <w:jc w:val="right"/>
-            </w:pPr>
-            <w:r/>
-            <w:r>
-              <w:rPr>
-                <w:rFonts w:ascii="Times New Roman" w:hAnsi="Times New Roman"/>
-                <w:b w:val="0"/>
-                <w:sz w:val="20"/>
-              </w:rPr>
-              <w:t>-0.82</w:t>
-            </w:r>
-          </w:p>
-        </w:tc>
-        <w:tc>
-          <w:tcPr>
-            <w:tcW w:type="dxa" w:w="1296"/>
-            <w:shd w:val="clear" w:color="auto" w:fill="FFFFFF"/>
-          </w:tcPr>
-          <w:p>
-            <w:pPr>
-              <w:jc w:val="right"/>
-            </w:pPr>
-            <w:r/>
-            <w:r>
-              <w:rPr>
-                <w:rFonts w:ascii="Times New Roman" w:hAnsi="Times New Roman"/>
-                <w:b w:val="0"/>
-                <w:sz w:val="20"/>
-              </w:rPr>
-              <w:t>0.206</w:t>
-            </w:r>
-          </w:p>
-        </w:tc>
-        <w:tc>
-          <w:tcPr>
-            <w:tcW w:type="dxa" w:w="1296"/>
-            <w:shd w:val="clear" w:color="auto" w:fill="FFFFFF"/>
-          </w:tcPr>
-          <w:p>
-            <w:pPr>
-              <w:jc w:val="right"/>
-            </w:pPr>
-            <w:r/>
-            <w:r>
-              <w:rPr>
-                <w:rFonts w:ascii="Times New Roman" w:hAnsi="Times New Roman"/>
-                <w:b w:val="0"/>
-                <w:sz w:val="20"/>
-              </w:rPr>
-              <w:t>-1.18</w:t>
-            </w:r>
-          </w:p>
-        </w:tc>
-        <w:tc>
-          <w:tcPr>
-            <w:tcW w:type="dxa" w:w="1296"/>
-            <w:shd w:val="clear" w:color="auto" w:fill="FFFFFF"/>
-          </w:tcPr>
-          <w:p>
-            <w:pPr>
-              <w:jc w:val="right"/>
-            </w:pPr>
-            <w:r/>
-            <w:r>
-              <w:rPr>
-                <w:rFonts w:ascii="Times New Roman" w:hAnsi="Times New Roman"/>
-                <w:b w:val="0"/>
-                <w:sz w:val="20"/>
-              </w:rPr>
-              <w:t>0.119</w:t>
-            </w:r>
-          </w:p>
-        </w:tc>
-      </w:tr>
-      <w:tr>
-        <w:tc>
-          <w:tcPr>
-            <w:tcW w:type="dxa" w:w="1296"/>
-            <w:shd w:val="clear" w:color="auto" w:fill="F2F2F2"/>
-          </w:tcPr>
-          <w:p>
-            <w:pPr>
-              <w:jc w:val="left"/>
-            </w:pPr>
-            <w:r/>
-            <w:r>
-              <w:rPr>
-                <w:rFonts w:ascii="Times New Roman" w:hAnsi="Times New Roman"/>
-                <w:b w:val="0"/>
-                <w:sz w:val="20"/>
-              </w:rPr>
-              <w:t>Analysis 04: FC -&gt; Daily Affect</w:t>
-            </w:r>
-          </w:p>
-        </w:tc>
-        <w:tc>
-          <w:tcPr>
-            <w:tcW w:type="dxa" w:w="1296"/>
-            <w:shd w:val="clear" w:color="auto" w:fill="F2F2F2"/>
-          </w:tcPr>
-          <w:p>
-            <w:pPr>
-              <w:jc w:val="left"/>
-            </w:pPr>
-            <w:r/>
-            <w:r>
-              <w:rPr>
-                <w:rFonts w:ascii="Times New Roman" w:hAnsi="Times New Roman"/>
-                <w:b w:val="0"/>
-                <w:sz w:val="20"/>
-              </w:rPr>
-              <w:t>Left amygdala-post. vmPFC FC</w:t>
-            </w:r>
-          </w:p>
-        </w:tc>
-        <w:tc>
-          <w:tcPr>
-            <w:tcW w:type="dxa" w:w="1296"/>
-            <w:shd w:val="clear" w:color="auto" w:fill="F2F2F2"/>
-          </w:tcPr>
-          <w:p>
-            <w:pPr>
-              <w:jc w:val="left"/>
-            </w:pPr>
-            <w:r/>
-            <w:r>
-              <w:rPr>
-                <w:rFonts w:ascii="Times New Roman" w:hAnsi="Times New Roman"/>
-                <w:b w:val="0"/>
-                <w:sz w:val="20"/>
-              </w:rPr>
-              <w:t>Negative affect, log (diary)</w:t>
-            </w:r>
-          </w:p>
-        </w:tc>
-        <w:tc>
-          <w:tcPr>
-            <w:tcW w:type="dxa" w:w="1296"/>
-            <w:shd w:val="clear" w:color="auto" w:fill="F2F2F2"/>
-          </w:tcPr>
-          <w:p>
-            <w:pPr>
-              <w:jc w:val="right"/>
-            </w:pPr>
-            <w:r/>
-            <w:r>
-              <w:rPr>
-                <w:rFonts w:ascii="Times New Roman" w:hAnsi="Times New Roman"/>
-                <w:b w:val="0"/>
-                <w:sz w:val="20"/>
-              </w:rPr>
-              <w:t>80</w:t>
-            </w:r>
-          </w:p>
-        </w:tc>
-        <w:tc>
-          <w:tcPr>
-            <w:tcW w:type="dxa" w:w="1296"/>
-            <w:shd w:val="clear" w:color="auto" w:fill="F2F2F2"/>
-          </w:tcPr>
-          <w:p>
-            <w:pPr>
-              <w:jc w:val="right"/>
-            </w:pPr>
-            <w:r/>
-            <w:r>
-              <w:rPr>
-                <w:rFonts w:ascii="Times New Roman" w:hAnsi="Times New Roman"/>
-                <w:b w:val="0"/>
-                <w:sz w:val="20"/>
-              </w:rPr>
-              <w:t>-0.207</w:t>
-            </w:r>
-          </w:p>
-        </w:tc>
-        <w:tc>
-          <w:tcPr>
-            <w:tcW w:type="dxa" w:w="1296"/>
-            <w:shd w:val="clear" w:color="auto" w:fill="F2F2F2"/>
-          </w:tcPr>
-          <w:p>
-            <w:pPr>
-              <w:jc w:val="right"/>
-            </w:pPr>
-            <w:r/>
-            <w:r>
-              <w:rPr>
-                <w:rFonts w:ascii="Times New Roman" w:hAnsi="Times New Roman"/>
-                <w:b/>
-                <w:sz w:val="20"/>
-              </w:rPr>
-              <w:t>0.033*</w:t>
-            </w:r>
-          </w:p>
-        </w:tc>
-        <w:tc>
-          <w:tcPr>
-            <w:tcW w:type="dxa" w:w="1296"/>
-            <w:shd w:val="clear" w:color="auto" w:fill="F2F2F2"/>
-          </w:tcPr>
-          <w:p>
-            <w:pPr>
-              <w:jc w:val="right"/>
-            </w:pPr>
-            <w:r/>
-            <w:r>
-              <w:rPr>
-                <w:rFonts w:ascii="Times New Roman" w:hAnsi="Times New Roman"/>
-                <w:b w:val="0"/>
-                <w:sz w:val="20"/>
-              </w:rPr>
-              <w:t>-1.11</w:t>
-            </w:r>
-          </w:p>
-        </w:tc>
-        <w:tc>
-          <w:tcPr>
-            <w:tcW w:type="dxa" w:w="1296"/>
-            <w:shd w:val="clear" w:color="auto" w:fill="F2F2F2"/>
-          </w:tcPr>
-          <w:p>
-            <w:pPr>
-              <w:jc w:val="right"/>
-            </w:pPr>
-            <w:r/>
-            <w:r>
-              <w:rPr>
-                <w:rFonts w:ascii="Times New Roman" w:hAnsi="Times New Roman"/>
-                <w:b w:val="0"/>
-                <w:sz w:val="20"/>
-              </w:rPr>
-              <w:t>0.137</w:t>
-            </w:r>
-          </w:p>
-        </w:tc>
-        <w:tc>
-          <w:tcPr>
-            <w:tcW w:type="dxa" w:w="1296"/>
-            <w:shd w:val="clear" w:color="auto" w:fill="F2F2F2"/>
-          </w:tcPr>
-          <w:p>
-            <w:pPr>
-              <w:jc w:val="right"/>
-            </w:pPr>
-            <w:r/>
-            <w:r>
-              <w:rPr>
-                <w:rFonts w:ascii="Times New Roman" w:hAnsi="Times New Roman"/>
-                <w:b w:val="0"/>
-                <w:sz w:val="20"/>
-              </w:rPr>
-              <w:t>-1.53</w:t>
-            </w:r>
-          </w:p>
-        </w:tc>
-        <w:tc>
-          <w:tcPr>
-            <w:tcW w:type="dxa" w:w="1296"/>
-            <w:shd w:val="clear" w:color="auto" w:fill="F2F2F2"/>
           </w:tcPr>
           <w:p>
             <w:pPr>
@@ -2885,7 +1755,1701 @@
       <w:tr>
         <w:tc>
           <w:tcPr>
-            <w:tcW w:type="dxa" w:w="1296"/>
+            <w:tcW w:type="dxa" w:w="1080"/>
+            <w:shd w:val="clear" w:color="auto" w:fill="D9D9D9"/>
+          </w:tcPr>
+          <w:p>
+            <w:pPr>
+              <w:jc w:val="left"/>
+            </w:pPr>
+            <w:r/>
+            <w:r>
+              <w:rPr>
+                <w:rFonts w:ascii="Times New Roman" w:hAnsi="Times New Roman"/>
+                <w:b w:val="0"/>
+                <w:sz w:val="20"/>
+              </w:rPr>
+              <w:t>Analysis 03: Age -&gt; Persistence</w:t>
+            </w:r>
+          </w:p>
+        </w:tc>
+        <w:tc>
+          <w:tcPr>
+            <w:tcW w:type="dxa" w:w="1080"/>
+            <w:shd w:val="clear" w:color="auto" w:fill="D9D9D9"/>
+          </w:tcPr>
+          <w:p>
+            <w:pPr>
+              <w:jc w:val="left"/>
+            </w:pPr>
+            <w:r/>
+            <w:r>
+              <w:rPr>
+                <w:rFonts w:ascii="Times New Roman" w:hAnsi="Times New Roman"/>
+                <w:b w:val="0"/>
+                <w:sz w:val="20"/>
+              </w:rPr>
+              <w:t>Age (Project 5)</w:t>
+            </w:r>
+          </w:p>
+        </w:tc>
+        <w:tc>
+          <w:tcPr>
+            <w:tcW w:type="dxa" w:w="1080"/>
+            <w:shd w:val="clear" w:color="auto" w:fill="D9D9D9"/>
+          </w:tcPr>
+          <w:p>
+            <w:pPr>
+              <w:jc w:val="left"/>
+            </w:pPr>
+            <w:r/>
+            <w:r>
+              <w:rPr>
+                <w:rFonts w:ascii="Times New Roman" w:hAnsi="Times New Roman"/>
+                <w:b w:val="0"/>
+                <w:sz w:val="20"/>
+              </w:rPr>
+              <w:t>Neg. persistence, left amygdala</w:t>
+            </w:r>
+          </w:p>
+        </w:tc>
+        <w:tc>
+          <w:tcPr>
+            <w:tcW w:type="dxa" w:w="1080"/>
+            <w:shd w:val="clear" w:color="auto" w:fill="D9D9D9"/>
+          </w:tcPr>
+          <w:p>
+            <w:pPr>
+              <w:jc w:val="right"/>
+            </w:pPr>
+            <w:r/>
+            <w:r>
+              <w:rPr>
+                <w:rFonts w:ascii="Times New Roman" w:hAnsi="Times New Roman"/>
+                <w:b w:val="0"/>
+                <w:sz w:val="20"/>
+              </w:rPr>
+              <w:t>127</w:t>
+            </w:r>
+          </w:p>
+        </w:tc>
+        <w:tc>
+          <w:tcPr>
+            <w:tcW w:type="dxa" w:w="1080"/>
+            <w:shd w:val="clear" w:color="auto" w:fill="D9D9D9"/>
+          </w:tcPr>
+          <w:p>
+            <w:pPr>
+              <w:jc w:val="right"/>
+            </w:pPr>
+            <w:r/>
+            <w:r>
+              <w:rPr>
+                <w:rFonts w:ascii="Times New Roman" w:hAnsi="Times New Roman"/>
+                <w:b w:val="0"/>
+                <w:sz w:val="20"/>
+              </w:rPr>
+              <w:t>-0.176</w:t>
+            </w:r>
+          </w:p>
+        </w:tc>
+        <w:tc>
+          <w:tcPr>
+            <w:tcW w:type="dxa" w:w="1080"/>
+            <w:shd w:val="clear" w:color="auto" w:fill="D9D9D9"/>
+          </w:tcPr>
+          <w:p>
+            <w:pPr>
+              <w:jc w:val="right"/>
+            </w:pPr>
+            <w:r/>
+            <w:r>
+              <w:rPr>
+                <w:rFonts w:ascii="Times New Roman" w:hAnsi="Times New Roman"/>
+                <w:b/>
+                <w:sz w:val="20"/>
+              </w:rPr>
+              <w:t>0.024*</w:t>
+            </w:r>
+          </w:p>
+        </w:tc>
+        <w:tc>
+          <w:tcPr>
+            <w:tcW w:type="dxa" w:w="1080"/>
+            <w:shd w:val="clear" w:color="auto" w:fill="D9D9D9"/>
+          </w:tcPr>
+          <w:p>
+            <w:pPr>
+              <w:jc w:val="right"/>
+            </w:pPr>
+            <w:r/>
+            <w:r>
+              <w:rPr>
+                <w:rFonts w:ascii="Times New Roman" w:hAnsi="Times New Roman"/>
+                <w:b w:val="0"/>
+                <w:sz w:val="20"/>
+              </w:rPr>
+              <w:t>127</w:t>
+            </w:r>
+          </w:p>
+        </w:tc>
+        <w:tc>
+          <w:tcPr>
+            <w:tcW w:type="dxa" w:w="1080"/>
+            <w:shd w:val="clear" w:color="auto" w:fill="D9D9D9"/>
+          </w:tcPr>
+          <w:p>
+            <w:pPr>
+              <w:jc w:val="right"/>
+            </w:pPr>
+            <w:r/>
+            <w:r>
+              <w:rPr>
+                <w:rFonts w:ascii="Times New Roman" w:hAnsi="Times New Roman"/>
+                <w:b w:val="0"/>
+                <w:sz w:val="20"/>
+              </w:rPr>
+              <w:t>-1.4</w:t>
+            </w:r>
+          </w:p>
+        </w:tc>
+        <w:tc>
+          <w:tcPr>
+            <w:tcW w:type="dxa" w:w="1080"/>
+            <w:shd w:val="clear" w:color="auto" w:fill="D9D9D9"/>
+          </w:tcPr>
+          <w:p>
+            <w:pPr>
+              <w:jc w:val="right"/>
+            </w:pPr>
+            <w:r/>
+            <w:r>
+              <w:rPr>
+                <w:rFonts w:ascii="Times New Roman" w:hAnsi="Times New Roman"/>
+                <w:b w:val="0"/>
+                <w:sz w:val="20"/>
+              </w:rPr>
+              <w:t>0.082</w:t>
+            </w:r>
+          </w:p>
+        </w:tc>
+        <w:tc>
+          <w:tcPr>
+            <w:tcW w:type="dxa" w:w="1080"/>
+            <w:shd w:val="clear" w:color="auto" w:fill="D9D9D9"/>
+          </w:tcPr>
+          <w:p>
+            <w:pPr>
+              <w:jc w:val="right"/>
+            </w:pPr>
+            <w:r/>
+            <w:r>
+              <w:rPr>
+                <w:rFonts w:ascii="Times New Roman" w:hAnsi="Times New Roman"/>
+                <w:b w:val="0"/>
+                <w:sz w:val="20"/>
+              </w:rPr>
+              <w:t>127</w:t>
+            </w:r>
+          </w:p>
+        </w:tc>
+        <w:tc>
+          <w:tcPr>
+            <w:tcW w:type="dxa" w:w="1080"/>
+            <w:shd w:val="clear" w:color="auto" w:fill="D9D9D9"/>
+          </w:tcPr>
+          <w:p>
+            <w:pPr>
+              <w:jc w:val="right"/>
+            </w:pPr>
+            <w:r/>
+            <w:r>
+              <w:rPr>
+                <w:rFonts w:ascii="Times New Roman" w:hAnsi="Times New Roman"/>
+                <w:b w:val="0"/>
+                <w:sz w:val="20"/>
+              </w:rPr>
+              <w:t>-2.09</w:t>
+            </w:r>
+          </w:p>
+        </w:tc>
+        <w:tc>
+          <w:tcPr>
+            <w:tcW w:type="dxa" w:w="1080"/>
+            <w:shd w:val="clear" w:color="auto" w:fill="D9D9D9"/>
+          </w:tcPr>
+          <w:p>
+            <w:pPr>
+              <w:jc w:val="right"/>
+            </w:pPr>
+            <w:r/>
+            <w:r>
+              <w:rPr>
+                <w:rFonts w:ascii="Times New Roman" w:hAnsi="Times New Roman"/>
+                <w:b/>
+                <w:sz w:val="20"/>
+              </w:rPr>
+              <w:t>0.018*</w:t>
+            </w:r>
+          </w:p>
+        </w:tc>
+      </w:tr>
+      <w:tr>
+        <w:tc>
+          <w:tcPr>
+            <w:tcW w:type="dxa" w:w="1080"/>
+            <w:shd w:val="clear" w:color="auto" w:fill="D9D9D9"/>
+          </w:tcPr>
+          <w:p>
+            <w:pPr>
+              <w:jc w:val="left"/>
+            </w:pPr>
+            <w:r/>
+            <w:r>
+              <w:rPr>
+                <w:rFonts w:ascii="Times New Roman" w:hAnsi="Times New Roman"/>
+                <w:b w:val="0"/>
+                <w:sz w:val="20"/>
+              </w:rPr>
+              <w:t>Analysis 04: FC -&gt; Daily Affect</w:t>
+            </w:r>
+          </w:p>
+        </w:tc>
+        <w:tc>
+          <w:tcPr>
+            <w:tcW w:type="dxa" w:w="1080"/>
+            <w:shd w:val="clear" w:color="auto" w:fill="D9D9D9"/>
+          </w:tcPr>
+          <w:p>
+            <w:pPr>
+              <w:jc w:val="left"/>
+            </w:pPr>
+            <w:r/>
+            <w:r>
+              <w:rPr>
+                <w:rFonts w:ascii="Times New Roman" w:hAnsi="Times New Roman"/>
+                <w:b w:val="0"/>
+                <w:sz w:val="20"/>
+              </w:rPr>
+              <w:t>Left amygdala-ant. vmPFC FC</w:t>
+            </w:r>
+          </w:p>
+        </w:tc>
+        <w:tc>
+          <w:tcPr>
+            <w:tcW w:type="dxa" w:w="1080"/>
+            <w:shd w:val="clear" w:color="auto" w:fill="D9D9D9"/>
+          </w:tcPr>
+          <w:p>
+            <w:pPr>
+              <w:jc w:val="left"/>
+            </w:pPr>
+            <w:r/>
+            <w:r>
+              <w:rPr>
+                <w:rFonts w:ascii="Times New Roman" w:hAnsi="Times New Roman"/>
+                <w:b w:val="0"/>
+                <w:sz w:val="20"/>
+              </w:rPr>
+              <w:t>Positive affect (diary)</w:t>
+            </w:r>
+          </w:p>
+        </w:tc>
+        <w:tc>
+          <w:tcPr>
+            <w:tcW w:type="dxa" w:w="1080"/>
+            <w:shd w:val="clear" w:color="auto" w:fill="D9D9D9"/>
+          </w:tcPr>
+          <w:p>
+            <w:pPr>
+              <w:jc w:val="right"/>
+            </w:pPr>
+            <w:r/>
+            <w:r>
+              <w:rPr>
+                <w:rFonts w:ascii="Times New Roman" w:hAnsi="Times New Roman"/>
+                <w:b w:val="0"/>
+                <w:sz w:val="20"/>
+              </w:rPr>
+              <w:t>81</w:t>
+            </w:r>
+          </w:p>
+        </w:tc>
+        <w:tc>
+          <w:tcPr>
+            <w:tcW w:type="dxa" w:w="1080"/>
+            <w:shd w:val="clear" w:color="auto" w:fill="D9D9D9"/>
+          </w:tcPr>
+          <w:p>
+            <w:pPr>
+              <w:jc w:val="right"/>
+            </w:pPr>
+            <w:r/>
+            <w:r>
+              <w:rPr>
+                <w:rFonts w:ascii="Times New Roman" w:hAnsi="Times New Roman"/>
+                <w:b w:val="0"/>
+                <w:sz w:val="20"/>
+              </w:rPr>
+              <w:t>-0.022</w:t>
+            </w:r>
+          </w:p>
+        </w:tc>
+        <w:tc>
+          <w:tcPr>
+            <w:tcW w:type="dxa" w:w="1080"/>
+            <w:shd w:val="clear" w:color="auto" w:fill="D9D9D9"/>
+          </w:tcPr>
+          <w:p>
+            <w:pPr>
+              <w:jc w:val="right"/>
+            </w:pPr>
+            <w:r/>
+            <w:r>
+              <w:rPr>
+                <w:rFonts w:ascii="Times New Roman" w:hAnsi="Times New Roman"/>
+                <w:b w:val="0"/>
+                <w:sz w:val="20"/>
+              </w:rPr>
+              <w:t>0.578</w:t>
+            </w:r>
+          </w:p>
+        </w:tc>
+        <w:tc>
+          <w:tcPr>
+            <w:tcW w:type="dxa" w:w="1080"/>
+            <w:shd w:val="clear" w:color="auto" w:fill="D9D9D9"/>
+          </w:tcPr>
+          <w:p>
+            <w:pPr>
+              <w:jc w:val="right"/>
+            </w:pPr>
+            <w:r/>
+            <w:r>
+              <w:rPr>
+                <w:rFonts w:ascii="Times New Roman" w:hAnsi="Times New Roman"/>
+                <w:b w:val="0"/>
+                <w:sz w:val="20"/>
+              </w:rPr>
+              <w:t>81</w:t>
+            </w:r>
+          </w:p>
+        </w:tc>
+        <w:tc>
+          <w:tcPr>
+            <w:tcW w:type="dxa" w:w="1080"/>
+            <w:shd w:val="clear" w:color="auto" w:fill="D9D9D9"/>
+          </w:tcPr>
+          <w:p>
+            <w:pPr>
+              <w:jc w:val="right"/>
+            </w:pPr>
+            <w:r/>
+            <w:r>
+              <w:rPr>
+                <w:rFonts w:ascii="Times New Roman" w:hAnsi="Times New Roman"/>
+                <w:b w:val="0"/>
+                <w:sz w:val="20"/>
+              </w:rPr>
+              <w:t>0.63</w:t>
+            </w:r>
+          </w:p>
+        </w:tc>
+        <w:tc>
+          <w:tcPr>
+            <w:tcW w:type="dxa" w:w="1080"/>
+            <w:shd w:val="clear" w:color="auto" w:fill="D9D9D9"/>
+          </w:tcPr>
+          <w:p>
+            <w:pPr>
+              <w:jc w:val="right"/>
+            </w:pPr>
+            <w:r/>
+            <w:r>
+              <w:rPr>
+                <w:rFonts w:ascii="Times New Roman" w:hAnsi="Times New Roman"/>
+                <w:b w:val="0"/>
+                <w:sz w:val="20"/>
+              </w:rPr>
+              <w:t>0.264</w:t>
+            </w:r>
+          </w:p>
+        </w:tc>
+        <w:tc>
+          <w:tcPr>
+            <w:tcW w:type="dxa" w:w="1080"/>
+            <w:shd w:val="clear" w:color="auto" w:fill="D9D9D9"/>
+          </w:tcPr>
+          <w:p>
+            <w:pPr>
+              <w:jc w:val="right"/>
+            </w:pPr>
+            <w:r/>
+            <w:r>
+              <w:rPr>
+                <w:rFonts w:ascii="Times New Roman" w:hAnsi="Times New Roman"/>
+                <w:b w:val="0"/>
+                <w:sz w:val="20"/>
+              </w:rPr>
+              <w:t>81</w:t>
+            </w:r>
+          </w:p>
+        </w:tc>
+        <w:tc>
+          <w:tcPr>
+            <w:tcW w:type="dxa" w:w="1080"/>
+            <w:shd w:val="clear" w:color="auto" w:fill="D9D9D9"/>
+          </w:tcPr>
+          <w:p>
+            <w:pPr>
+              <w:jc w:val="right"/>
+            </w:pPr>
+            <w:r/>
+            <w:r>
+              <w:rPr>
+                <w:rFonts w:ascii="Times New Roman" w:hAnsi="Times New Roman"/>
+                <w:b w:val="0"/>
+                <w:sz w:val="20"/>
+              </w:rPr>
+              <w:t>-0.08</w:t>
+            </w:r>
+          </w:p>
+        </w:tc>
+        <w:tc>
+          <w:tcPr>
+            <w:tcW w:type="dxa" w:w="1080"/>
+            <w:shd w:val="clear" w:color="auto" w:fill="D9D9D9"/>
+          </w:tcPr>
+          <w:p>
+            <w:pPr>
+              <w:jc w:val="right"/>
+            </w:pPr>
+            <w:r/>
+            <w:r>
+              <w:rPr>
+                <w:rFonts w:ascii="Times New Roman" w:hAnsi="Times New Roman"/>
+                <w:b w:val="0"/>
+                <w:sz w:val="20"/>
+              </w:rPr>
+              <w:t>0.532</w:t>
+            </w:r>
+          </w:p>
+        </w:tc>
+      </w:tr>
+      <w:tr>
+        <w:tc>
+          <w:tcPr>
+            <w:tcW w:type="dxa" w:w="1080"/>
+            <w:shd w:val="clear" w:color="auto" w:fill="F2F2F2"/>
+          </w:tcPr>
+          <w:p>
+            <w:pPr>
+              <w:jc w:val="left"/>
+            </w:pPr>
+            <w:r/>
+            <w:r>
+              <w:rPr>
+                <w:rFonts w:ascii="Times New Roman" w:hAnsi="Times New Roman"/>
+                <w:b w:val="0"/>
+                <w:sz w:val="20"/>
+              </w:rPr>
+              <w:t>Analysis 04: FC -&gt; Daily Affect</w:t>
+            </w:r>
+          </w:p>
+        </w:tc>
+        <w:tc>
+          <w:tcPr>
+            <w:tcW w:type="dxa" w:w="1080"/>
+            <w:shd w:val="clear" w:color="auto" w:fill="F2F2F2"/>
+          </w:tcPr>
+          <w:p>
+            <w:pPr>
+              <w:jc w:val="left"/>
+            </w:pPr>
+            <w:r/>
+            <w:r>
+              <w:rPr>
+                <w:rFonts w:ascii="Times New Roman" w:hAnsi="Times New Roman"/>
+                <w:b w:val="0"/>
+                <w:sz w:val="20"/>
+              </w:rPr>
+              <w:t>Left amygdala-ant. vmPFC FC</w:t>
+            </w:r>
+          </w:p>
+        </w:tc>
+        <w:tc>
+          <w:tcPr>
+            <w:tcW w:type="dxa" w:w="1080"/>
+            <w:shd w:val="clear" w:color="auto" w:fill="F2F2F2"/>
+          </w:tcPr>
+          <w:p>
+            <w:pPr>
+              <w:jc w:val="left"/>
+            </w:pPr>
+            <w:r/>
+            <w:r>
+              <w:rPr>
+                <w:rFonts w:ascii="Times New Roman" w:hAnsi="Times New Roman"/>
+                <w:b w:val="0"/>
+                <w:sz w:val="20"/>
+              </w:rPr>
+              <w:t>Negative affect (diary)</w:t>
+            </w:r>
+          </w:p>
+        </w:tc>
+        <w:tc>
+          <w:tcPr>
+            <w:tcW w:type="dxa" w:w="1080"/>
+            <w:shd w:val="clear" w:color="auto" w:fill="F2F2F2"/>
+          </w:tcPr>
+          <w:p>
+            <w:pPr>
+              <w:jc w:val="right"/>
+            </w:pPr>
+            <w:r/>
+            <w:r>
+              <w:rPr>
+                <w:rFonts w:ascii="Times New Roman" w:hAnsi="Times New Roman"/>
+                <w:b w:val="0"/>
+                <w:sz w:val="20"/>
+              </w:rPr>
+              <w:t>81</w:t>
+            </w:r>
+          </w:p>
+        </w:tc>
+        <w:tc>
+          <w:tcPr>
+            <w:tcW w:type="dxa" w:w="1080"/>
+            <w:shd w:val="clear" w:color="auto" w:fill="F2F2F2"/>
+          </w:tcPr>
+          <w:p>
+            <w:pPr>
+              <w:jc w:val="right"/>
+            </w:pPr>
+            <w:r/>
+            <w:r>
+              <w:rPr>
+                <w:rFonts w:ascii="Times New Roman" w:hAnsi="Times New Roman"/>
+                <w:b w:val="0"/>
+                <w:sz w:val="20"/>
+              </w:rPr>
+              <w:t>-0.149</w:t>
+            </w:r>
+          </w:p>
+        </w:tc>
+        <w:tc>
+          <w:tcPr>
+            <w:tcW w:type="dxa" w:w="1080"/>
+            <w:shd w:val="clear" w:color="auto" w:fill="F2F2F2"/>
+          </w:tcPr>
+          <w:p>
+            <w:pPr>
+              <w:jc w:val="right"/>
+            </w:pPr>
+            <w:r/>
+            <w:r>
+              <w:rPr>
+                <w:rFonts w:ascii="Times New Roman" w:hAnsi="Times New Roman"/>
+                <w:b w:val="0"/>
+                <w:sz w:val="20"/>
+              </w:rPr>
+              <w:t>0.093</w:t>
+            </w:r>
+          </w:p>
+        </w:tc>
+        <w:tc>
+          <w:tcPr>
+            <w:tcW w:type="dxa" w:w="1080"/>
+            <w:shd w:val="clear" w:color="auto" w:fill="F2F2F2"/>
+          </w:tcPr>
+          <w:p>
+            <w:pPr>
+              <w:jc w:val="right"/>
+            </w:pPr>
+            <w:r/>
+            <w:r>
+              <w:rPr>
+                <w:rFonts w:ascii="Times New Roman" w:hAnsi="Times New Roman"/>
+                <w:b w:val="0"/>
+                <w:sz w:val="20"/>
+              </w:rPr>
+              <w:t>81</w:t>
+            </w:r>
+          </w:p>
+        </w:tc>
+        <w:tc>
+          <w:tcPr>
+            <w:tcW w:type="dxa" w:w="1080"/>
+            <w:shd w:val="clear" w:color="auto" w:fill="F2F2F2"/>
+          </w:tcPr>
+          <w:p>
+            <w:pPr>
+              <w:jc w:val="right"/>
+            </w:pPr>
+            <w:r/>
+            <w:r>
+              <w:rPr>
+                <w:rFonts w:ascii="Times New Roman" w:hAnsi="Times New Roman"/>
+                <w:b w:val="0"/>
+                <w:sz w:val="20"/>
+              </w:rPr>
+              <w:t>-1.39</w:t>
+            </w:r>
+          </w:p>
+        </w:tc>
+        <w:tc>
+          <w:tcPr>
+            <w:tcW w:type="dxa" w:w="1080"/>
+            <w:shd w:val="clear" w:color="auto" w:fill="F2F2F2"/>
+          </w:tcPr>
+          <w:p>
+            <w:pPr>
+              <w:jc w:val="right"/>
+            </w:pPr>
+            <w:r/>
+            <w:r>
+              <w:rPr>
+                <w:rFonts w:ascii="Times New Roman" w:hAnsi="Times New Roman"/>
+                <w:b w:val="0"/>
+                <w:sz w:val="20"/>
+              </w:rPr>
+              <w:t>0.085</w:t>
+            </w:r>
+          </w:p>
+        </w:tc>
+        <w:tc>
+          <w:tcPr>
+            <w:tcW w:type="dxa" w:w="1080"/>
+            <w:shd w:val="clear" w:color="auto" w:fill="F2F2F2"/>
+          </w:tcPr>
+          <w:p>
+            <w:pPr>
+              <w:jc w:val="right"/>
+            </w:pPr>
+            <w:r/>
+            <w:r>
+              <w:rPr>
+                <w:rFonts w:ascii="Times New Roman" w:hAnsi="Times New Roman"/>
+                <w:b w:val="0"/>
+                <w:sz w:val="20"/>
+              </w:rPr>
+              <w:t>81</w:t>
+            </w:r>
+          </w:p>
+        </w:tc>
+        <w:tc>
+          <w:tcPr>
+            <w:tcW w:type="dxa" w:w="1080"/>
+            <w:shd w:val="clear" w:color="auto" w:fill="F2F2F2"/>
+          </w:tcPr>
+          <w:p>
+            <w:pPr>
+              <w:jc w:val="right"/>
+            </w:pPr>
+            <w:r/>
+            <w:r>
+              <w:rPr>
+                <w:rFonts w:ascii="Times New Roman" w:hAnsi="Times New Roman"/>
+                <w:b w:val="0"/>
+                <w:sz w:val="20"/>
+              </w:rPr>
+              <w:t>-1.76</w:t>
+            </w:r>
+          </w:p>
+        </w:tc>
+        <w:tc>
+          <w:tcPr>
+            <w:tcW w:type="dxa" w:w="1080"/>
+            <w:shd w:val="clear" w:color="auto" w:fill="F2F2F2"/>
+          </w:tcPr>
+          <w:p>
+            <w:pPr>
+              <w:jc w:val="right"/>
+            </w:pPr>
+            <w:r/>
+            <w:r>
+              <w:rPr>
+                <w:rFonts w:ascii="Times New Roman" w:hAnsi="Times New Roman"/>
+                <w:b/>
+                <w:sz w:val="20"/>
+              </w:rPr>
+              <w:t>0.039*</w:t>
+            </w:r>
+          </w:p>
+        </w:tc>
+      </w:tr>
+      <w:tr>
+        <w:tc>
+          <w:tcPr>
+            <w:tcW w:type="dxa" w:w="1080"/>
+            <w:shd w:val="clear" w:color="auto" w:fill="FFFFFF"/>
+          </w:tcPr>
+          <w:p>
+            <w:pPr>
+              <w:jc w:val="left"/>
+            </w:pPr>
+            <w:r/>
+            <w:r>
+              <w:rPr>
+                <w:rFonts w:ascii="Times New Roman" w:hAnsi="Times New Roman"/>
+                <w:b w:val="0"/>
+                <w:sz w:val="20"/>
+              </w:rPr>
+              <w:t>Analysis 04: FC -&gt; Daily Affect</w:t>
+            </w:r>
+          </w:p>
+        </w:tc>
+        <w:tc>
+          <w:tcPr>
+            <w:tcW w:type="dxa" w:w="1080"/>
+            <w:shd w:val="clear" w:color="auto" w:fill="FFFFFF"/>
+          </w:tcPr>
+          <w:p>
+            <w:pPr>
+              <w:jc w:val="left"/>
+            </w:pPr>
+            <w:r/>
+            <w:r>
+              <w:rPr>
+                <w:rFonts w:ascii="Times New Roman" w:hAnsi="Times New Roman"/>
+                <w:b w:val="0"/>
+                <w:sz w:val="20"/>
+              </w:rPr>
+              <w:t>Left amygdala-ant. vmPFC FC</w:t>
+            </w:r>
+          </w:p>
+        </w:tc>
+        <w:tc>
+          <w:tcPr>
+            <w:tcW w:type="dxa" w:w="1080"/>
+            <w:shd w:val="clear" w:color="auto" w:fill="FFFFFF"/>
+          </w:tcPr>
+          <w:p>
+            <w:pPr>
+              <w:jc w:val="left"/>
+            </w:pPr>
+            <w:r/>
+            <w:r>
+              <w:rPr>
+                <w:rFonts w:ascii="Times New Roman" w:hAnsi="Times New Roman"/>
+                <w:b w:val="0"/>
+                <w:sz w:val="20"/>
+              </w:rPr>
+              <w:t>Negative affect, log (diary)</w:t>
+            </w:r>
+          </w:p>
+        </w:tc>
+        <w:tc>
+          <w:tcPr>
+            <w:tcW w:type="dxa" w:w="1080"/>
+            <w:shd w:val="clear" w:color="auto" w:fill="FFFFFF"/>
+          </w:tcPr>
+          <w:p>
+            <w:pPr>
+              <w:jc w:val="right"/>
+            </w:pPr>
+            <w:r/>
+            <w:r>
+              <w:rPr>
+                <w:rFonts w:ascii="Times New Roman" w:hAnsi="Times New Roman"/>
+                <w:b w:val="0"/>
+                <w:sz w:val="20"/>
+              </w:rPr>
+              <w:t>81</w:t>
+            </w:r>
+          </w:p>
+        </w:tc>
+        <w:tc>
+          <w:tcPr>
+            <w:tcW w:type="dxa" w:w="1080"/>
+            <w:shd w:val="clear" w:color="auto" w:fill="FFFFFF"/>
+          </w:tcPr>
+          <w:p>
+            <w:pPr>
+              <w:jc w:val="right"/>
+            </w:pPr>
+            <w:r/>
+            <w:r>
+              <w:rPr>
+                <w:rFonts w:ascii="Times New Roman" w:hAnsi="Times New Roman"/>
+                <w:b w:val="0"/>
+                <w:sz w:val="20"/>
+              </w:rPr>
+              <w:t>-0.189</w:t>
+            </w:r>
+          </w:p>
+        </w:tc>
+        <w:tc>
+          <w:tcPr>
+            <w:tcW w:type="dxa" w:w="1080"/>
+            <w:shd w:val="clear" w:color="auto" w:fill="FFFFFF"/>
+          </w:tcPr>
+          <w:p>
+            <w:pPr>
+              <w:jc w:val="right"/>
+            </w:pPr>
+            <w:r/>
+            <w:r>
+              <w:rPr>
+                <w:rFonts w:ascii="Times New Roman" w:hAnsi="Times New Roman"/>
+                <w:b/>
+                <w:sz w:val="20"/>
+              </w:rPr>
+              <w:t>0.045*</w:t>
+            </w:r>
+          </w:p>
+        </w:tc>
+        <w:tc>
+          <w:tcPr>
+            <w:tcW w:type="dxa" w:w="1080"/>
+            <w:shd w:val="clear" w:color="auto" w:fill="FFFFFF"/>
+          </w:tcPr>
+          <w:p>
+            <w:pPr>
+              <w:jc w:val="right"/>
+            </w:pPr>
+            <w:r/>
+            <w:r>
+              <w:rPr>
+                <w:rFonts w:ascii="Times New Roman" w:hAnsi="Times New Roman"/>
+                <w:b w:val="0"/>
+                <w:sz w:val="20"/>
+              </w:rPr>
+              <w:t>81</w:t>
+            </w:r>
+          </w:p>
+        </w:tc>
+        <w:tc>
+          <w:tcPr>
+            <w:tcW w:type="dxa" w:w="1080"/>
+            <w:shd w:val="clear" w:color="auto" w:fill="FFFFFF"/>
+          </w:tcPr>
+          <w:p>
+            <w:pPr>
+              <w:jc w:val="right"/>
+            </w:pPr>
+            <w:r/>
+            <w:r>
+              <w:rPr>
+                <w:rFonts w:ascii="Times New Roman" w:hAnsi="Times New Roman"/>
+                <w:b w:val="0"/>
+                <w:sz w:val="20"/>
+              </w:rPr>
+              <w:t>-1.92</w:t>
+            </w:r>
+          </w:p>
+        </w:tc>
+        <w:tc>
+          <w:tcPr>
+            <w:tcW w:type="dxa" w:w="1080"/>
+            <w:shd w:val="clear" w:color="auto" w:fill="FFFFFF"/>
+          </w:tcPr>
+          <w:p>
+            <w:pPr>
+              <w:jc w:val="right"/>
+            </w:pPr>
+            <w:r/>
+            <w:r>
+              <w:rPr>
+                <w:rFonts w:ascii="Times New Roman" w:hAnsi="Times New Roman"/>
+                <w:b/>
+                <w:sz w:val="20"/>
+              </w:rPr>
+              <w:t>0.030*</w:t>
+            </w:r>
+          </w:p>
+        </w:tc>
+        <w:tc>
+          <w:tcPr>
+            <w:tcW w:type="dxa" w:w="1080"/>
+            <w:shd w:val="clear" w:color="auto" w:fill="FFFFFF"/>
+          </w:tcPr>
+          <w:p>
+            <w:pPr>
+              <w:jc w:val="right"/>
+            </w:pPr>
+            <w:r/>
+            <w:r>
+              <w:rPr>
+                <w:rFonts w:ascii="Times New Roman" w:hAnsi="Times New Roman"/>
+                <w:b w:val="0"/>
+                <w:sz w:val="20"/>
+              </w:rPr>
+              <w:t>81</w:t>
+            </w:r>
+          </w:p>
+        </w:tc>
+        <w:tc>
+          <w:tcPr>
+            <w:tcW w:type="dxa" w:w="1080"/>
+            <w:shd w:val="clear" w:color="auto" w:fill="FFFFFF"/>
+          </w:tcPr>
+          <w:p>
+            <w:pPr>
+              <w:jc w:val="right"/>
+            </w:pPr>
+            <w:r/>
+            <w:r>
+              <w:rPr>
+                <w:rFonts w:ascii="Times New Roman" w:hAnsi="Times New Roman"/>
+                <w:b w:val="0"/>
+                <w:sz w:val="20"/>
+              </w:rPr>
+              <w:t>-2.19</w:t>
+            </w:r>
+          </w:p>
+        </w:tc>
+        <w:tc>
+          <w:tcPr>
+            <w:tcW w:type="dxa" w:w="1080"/>
+            <w:shd w:val="clear" w:color="auto" w:fill="FFFFFF"/>
+          </w:tcPr>
+          <w:p>
+            <w:pPr>
+              <w:jc w:val="right"/>
+            </w:pPr>
+            <w:r/>
+            <w:r>
+              <w:rPr>
+                <w:rFonts w:ascii="Times New Roman" w:hAnsi="Times New Roman"/>
+                <w:b/>
+                <w:sz w:val="20"/>
+              </w:rPr>
+              <w:t>0.014*</w:t>
+            </w:r>
+          </w:p>
+        </w:tc>
+      </w:tr>
+      <w:tr>
+        <w:tc>
+          <w:tcPr>
+            <w:tcW w:type="dxa" w:w="1080"/>
+            <w:shd w:val="clear" w:color="auto" w:fill="F2F2F2"/>
+          </w:tcPr>
+          <w:p>
+            <w:pPr>
+              <w:jc w:val="left"/>
+            </w:pPr>
+            <w:r/>
+            <w:r>
+              <w:rPr>
+                <w:rFonts w:ascii="Times New Roman" w:hAnsi="Times New Roman"/>
+                <w:b w:val="0"/>
+                <w:sz w:val="20"/>
+              </w:rPr>
+              <w:t>Analysis 04: FC -&gt; Daily Affect</w:t>
+            </w:r>
+          </w:p>
+        </w:tc>
+        <w:tc>
+          <w:tcPr>
+            <w:tcW w:type="dxa" w:w="1080"/>
+            <w:shd w:val="clear" w:color="auto" w:fill="F2F2F2"/>
+          </w:tcPr>
+          <w:p>
+            <w:pPr>
+              <w:jc w:val="left"/>
+            </w:pPr>
+            <w:r/>
+            <w:r>
+              <w:rPr>
+                <w:rFonts w:ascii="Times New Roman" w:hAnsi="Times New Roman"/>
+                <w:b w:val="0"/>
+                <w:sz w:val="20"/>
+              </w:rPr>
+              <w:t>Left amygdala-post. vmPFC FC</w:t>
+            </w:r>
+          </w:p>
+        </w:tc>
+        <w:tc>
+          <w:tcPr>
+            <w:tcW w:type="dxa" w:w="1080"/>
+            <w:shd w:val="clear" w:color="auto" w:fill="F2F2F2"/>
+          </w:tcPr>
+          <w:p>
+            <w:pPr>
+              <w:jc w:val="left"/>
+            </w:pPr>
+            <w:r/>
+            <w:r>
+              <w:rPr>
+                <w:rFonts w:ascii="Times New Roman" w:hAnsi="Times New Roman"/>
+                <w:b w:val="0"/>
+                <w:sz w:val="20"/>
+              </w:rPr>
+              <w:t>Positive affect (diary)</w:t>
+            </w:r>
+          </w:p>
+        </w:tc>
+        <w:tc>
+          <w:tcPr>
+            <w:tcW w:type="dxa" w:w="1080"/>
+            <w:shd w:val="clear" w:color="auto" w:fill="F2F2F2"/>
+          </w:tcPr>
+          <w:p>
+            <w:pPr>
+              <w:jc w:val="right"/>
+            </w:pPr>
+            <w:r/>
+            <w:r>
+              <w:rPr>
+                <w:rFonts w:ascii="Times New Roman" w:hAnsi="Times New Roman"/>
+                <w:b w:val="0"/>
+                <w:sz w:val="20"/>
+              </w:rPr>
+              <w:t>81</w:t>
+            </w:r>
+          </w:p>
+        </w:tc>
+        <w:tc>
+          <w:tcPr>
+            <w:tcW w:type="dxa" w:w="1080"/>
+            <w:shd w:val="clear" w:color="auto" w:fill="F2F2F2"/>
+          </w:tcPr>
+          <w:p>
+            <w:pPr>
+              <w:jc w:val="right"/>
+            </w:pPr>
+            <w:r/>
+            <w:r>
+              <w:rPr>
+                <w:rFonts w:ascii="Times New Roman" w:hAnsi="Times New Roman"/>
+                <w:b w:val="0"/>
+                <w:sz w:val="20"/>
+              </w:rPr>
+              <w:t>0.032</w:t>
+            </w:r>
+          </w:p>
+        </w:tc>
+        <w:tc>
+          <w:tcPr>
+            <w:tcW w:type="dxa" w:w="1080"/>
+            <w:shd w:val="clear" w:color="auto" w:fill="F2F2F2"/>
+          </w:tcPr>
+          <w:p>
+            <w:pPr>
+              <w:jc w:val="right"/>
+            </w:pPr>
+            <w:r/>
+            <w:r>
+              <w:rPr>
+                <w:rFonts w:ascii="Times New Roman" w:hAnsi="Times New Roman"/>
+                <w:b w:val="0"/>
+                <w:sz w:val="20"/>
+              </w:rPr>
+              <w:t>0.388</w:t>
+            </w:r>
+          </w:p>
+        </w:tc>
+        <w:tc>
+          <w:tcPr>
+            <w:tcW w:type="dxa" w:w="1080"/>
+            <w:shd w:val="clear" w:color="auto" w:fill="F2F2F2"/>
+          </w:tcPr>
+          <w:p>
+            <w:pPr>
+              <w:jc w:val="right"/>
+            </w:pPr>
+            <w:r/>
+            <w:r>
+              <w:rPr>
+                <w:rFonts w:ascii="Times New Roman" w:hAnsi="Times New Roman"/>
+                <w:b w:val="0"/>
+                <w:sz w:val="20"/>
+              </w:rPr>
+              <w:t>81</w:t>
+            </w:r>
+          </w:p>
+        </w:tc>
+        <w:tc>
+          <w:tcPr>
+            <w:tcW w:type="dxa" w:w="1080"/>
+            <w:shd w:val="clear" w:color="auto" w:fill="F2F2F2"/>
+          </w:tcPr>
+          <w:p>
+            <w:pPr>
+              <w:jc w:val="right"/>
+            </w:pPr>
+            <w:r/>
+            <w:r>
+              <w:rPr>
+                <w:rFonts w:ascii="Times New Roman" w:hAnsi="Times New Roman"/>
+                <w:b w:val="0"/>
+                <w:sz w:val="20"/>
+              </w:rPr>
+              <w:t>0.23</w:t>
+            </w:r>
+          </w:p>
+        </w:tc>
+        <w:tc>
+          <w:tcPr>
+            <w:tcW w:type="dxa" w:w="1080"/>
+            <w:shd w:val="clear" w:color="auto" w:fill="F2F2F2"/>
+          </w:tcPr>
+          <w:p>
+            <w:pPr>
+              <w:jc w:val="right"/>
+            </w:pPr>
+            <w:r/>
+            <w:r>
+              <w:rPr>
+                <w:rFonts w:ascii="Times New Roman" w:hAnsi="Times New Roman"/>
+                <w:b w:val="0"/>
+                <w:sz w:val="20"/>
+              </w:rPr>
+              <w:t>0.410</w:t>
+            </w:r>
+          </w:p>
+        </w:tc>
+        <w:tc>
+          <w:tcPr>
+            <w:tcW w:type="dxa" w:w="1080"/>
+            <w:shd w:val="clear" w:color="auto" w:fill="F2F2F2"/>
+          </w:tcPr>
+          <w:p>
+            <w:pPr>
+              <w:jc w:val="right"/>
+            </w:pPr>
+            <w:r/>
+            <w:r>
+              <w:rPr>
+                <w:rFonts w:ascii="Times New Roman" w:hAnsi="Times New Roman"/>
+                <w:b w:val="0"/>
+                <w:sz w:val="20"/>
+              </w:rPr>
+              <w:t>81</w:t>
+            </w:r>
+          </w:p>
+        </w:tc>
+        <w:tc>
+          <w:tcPr>
+            <w:tcW w:type="dxa" w:w="1080"/>
+            <w:shd w:val="clear" w:color="auto" w:fill="F2F2F2"/>
+          </w:tcPr>
+          <w:p>
+            <w:pPr>
+              <w:jc w:val="right"/>
+            </w:pPr>
+            <w:r/>
+            <w:r>
+              <w:rPr>
+                <w:rFonts w:ascii="Times New Roman" w:hAnsi="Times New Roman"/>
+                <w:b w:val="0"/>
+                <w:sz w:val="20"/>
+              </w:rPr>
+              <w:t>-2.33</w:t>
+            </w:r>
+          </w:p>
+        </w:tc>
+        <w:tc>
+          <w:tcPr>
+            <w:tcW w:type="dxa" w:w="1080"/>
+            <w:shd w:val="clear" w:color="auto" w:fill="F2F2F2"/>
+          </w:tcPr>
+          <w:p>
+            <w:pPr>
+              <w:jc w:val="right"/>
+            </w:pPr>
+            <w:r/>
+            <w:r>
+              <w:rPr>
+                <w:rFonts w:ascii="Times New Roman" w:hAnsi="Times New Roman"/>
+                <w:b w:val="0"/>
+                <w:sz w:val="20"/>
+              </w:rPr>
+              <w:t>0.990</w:t>
+            </w:r>
+          </w:p>
+        </w:tc>
+      </w:tr>
+      <w:tr>
+        <w:tc>
+          <w:tcPr>
+            <w:tcW w:type="dxa" w:w="1080"/>
+            <w:shd w:val="clear" w:color="auto" w:fill="FFFFFF"/>
+          </w:tcPr>
+          <w:p>
+            <w:pPr>
+              <w:jc w:val="left"/>
+            </w:pPr>
+            <w:r/>
+            <w:r>
+              <w:rPr>
+                <w:rFonts w:ascii="Times New Roman" w:hAnsi="Times New Roman"/>
+                <w:b w:val="0"/>
+                <w:sz w:val="20"/>
+              </w:rPr>
+              <w:t>Analysis 04: FC -&gt; Daily Affect</w:t>
+            </w:r>
+          </w:p>
+        </w:tc>
+        <w:tc>
+          <w:tcPr>
+            <w:tcW w:type="dxa" w:w="1080"/>
+            <w:shd w:val="clear" w:color="auto" w:fill="FFFFFF"/>
+          </w:tcPr>
+          <w:p>
+            <w:pPr>
+              <w:jc w:val="left"/>
+            </w:pPr>
+            <w:r/>
+            <w:r>
+              <w:rPr>
+                <w:rFonts w:ascii="Times New Roman" w:hAnsi="Times New Roman"/>
+                <w:b w:val="0"/>
+                <w:sz w:val="20"/>
+              </w:rPr>
+              <w:t>Left amygdala-post. vmPFC FC</w:t>
+            </w:r>
+          </w:p>
+        </w:tc>
+        <w:tc>
+          <w:tcPr>
+            <w:tcW w:type="dxa" w:w="1080"/>
+            <w:shd w:val="clear" w:color="auto" w:fill="FFFFFF"/>
+          </w:tcPr>
+          <w:p>
+            <w:pPr>
+              <w:jc w:val="left"/>
+            </w:pPr>
+            <w:r/>
+            <w:r>
+              <w:rPr>
+                <w:rFonts w:ascii="Times New Roman" w:hAnsi="Times New Roman"/>
+                <w:b w:val="0"/>
+                <w:sz w:val="20"/>
+              </w:rPr>
+              <w:t>Negative affect (diary)</w:t>
+            </w:r>
+          </w:p>
+        </w:tc>
+        <w:tc>
+          <w:tcPr>
+            <w:tcW w:type="dxa" w:w="1080"/>
+            <w:shd w:val="clear" w:color="auto" w:fill="FFFFFF"/>
+          </w:tcPr>
+          <w:p>
+            <w:pPr>
+              <w:jc w:val="right"/>
+            </w:pPr>
+            <w:r/>
+            <w:r>
+              <w:rPr>
+                <w:rFonts w:ascii="Times New Roman" w:hAnsi="Times New Roman"/>
+                <w:b w:val="0"/>
+                <w:sz w:val="20"/>
+              </w:rPr>
+              <w:t>81</w:t>
+            </w:r>
+          </w:p>
+        </w:tc>
+        <w:tc>
+          <w:tcPr>
+            <w:tcW w:type="dxa" w:w="1080"/>
+            <w:shd w:val="clear" w:color="auto" w:fill="FFFFFF"/>
+          </w:tcPr>
+          <w:p>
+            <w:pPr>
+              <w:jc w:val="right"/>
+            </w:pPr>
+            <w:r/>
+            <w:r>
+              <w:rPr>
+                <w:rFonts w:ascii="Times New Roman" w:hAnsi="Times New Roman"/>
+                <w:b w:val="0"/>
+                <w:sz w:val="20"/>
+              </w:rPr>
+              <w:t>-0.106</w:t>
+            </w:r>
+          </w:p>
+        </w:tc>
+        <w:tc>
+          <w:tcPr>
+            <w:tcW w:type="dxa" w:w="1080"/>
+            <w:shd w:val="clear" w:color="auto" w:fill="FFFFFF"/>
+          </w:tcPr>
+          <w:p>
+            <w:pPr>
+              <w:jc w:val="right"/>
+            </w:pPr>
+            <w:r/>
+            <w:r>
+              <w:rPr>
+                <w:rFonts w:ascii="Times New Roman" w:hAnsi="Times New Roman"/>
+                <w:b w:val="0"/>
+                <w:sz w:val="20"/>
+              </w:rPr>
+              <w:t>0.173</w:t>
+            </w:r>
+          </w:p>
+        </w:tc>
+        <w:tc>
+          <w:tcPr>
+            <w:tcW w:type="dxa" w:w="1080"/>
+            <w:shd w:val="clear" w:color="auto" w:fill="FFFFFF"/>
+          </w:tcPr>
+          <w:p>
+            <w:pPr>
+              <w:jc w:val="right"/>
+            </w:pPr>
+            <w:r/>
+            <w:r>
+              <w:rPr>
+                <w:rFonts w:ascii="Times New Roman" w:hAnsi="Times New Roman"/>
+                <w:b w:val="0"/>
+                <w:sz w:val="20"/>
+              </w:rPr>
+              <w:t>81</w:t>
+            </w:r>
+          </w:p>
+        </w:tc>
+        <w:tc>
+          <w:tcPr>
+            <w:tcW w:type="dxa" w:w="1080"/>
+            <w:shd w:val="clear" w:color="auto" w:fill="FFFFFF"/>
+          </w:tcPr>
+          <w:p>
+            <w:pPr>
+              <w:jc w:val="right"/>
+            </w:pPr>
+            <w:r/>
+            <w:r>
+              <w:rPr>
+                <w:rFonts w:ascii="Times New Roman" w:hAnsi="Times New Roman"/>
+                <w:b w:val="0"/>
+                <w:sz w:val="20"/>
+              </w:rPr>
+              <w:t>-0.89</w:t>
+            </w:r>
+          </w:p>
+        </w:tc>
+        <w:tc>
+          <w:tcPr>
+            <w:tcW w:type="dxa" w:w="1080"/>
+            <w:shd w:val="clear" w:color="auto" w:fill="FFFFFF"/>
+          </w:tcPr>
+          <w:p>
+            <w:pPr>
+              <w:jc w:val="right"/>
+            </w:pPr>
+            <w:r/>
+            <w:r>
+              <w:rPr>
+                <w:rFonts w:ascii="Times New Roman" w:hAnsi="Times New Roman"/>
+                <w:b w:val="0"/>
+                <w:sz w:val="20"/>
+              </w:rPr>
+              <w:t>0.189</w:t>
+            </w:r>
+          </w:p>
+        </w:tc>
+        <w:tc>
+          <w:tcPr>
+            <w:tcW w:type="dxa" w:w="1080"/>
+            <w:shd w:val="clear" w:color="auto" w:fill="FFFFFF"/>
+          </w:tcPr>
+          <w:p>
+            <w:pPr>
+              <w:jc w:val="right"/>
+            </w:pPr>
+            <w:r/>
+            <w:r>
+              <w:rPr>
+                <w:rFonts w:ascii="Times New Roman" w:hAnsi="Times New Roman"/>
+                <w:b w:val="0"/>
+                <w:sz w:val="20"/>
+              </w:rPr>
+              <w:t>81</w:t>
+            </w:r>
+          </w:p>
+        </w:tc>
+        <w:tc>
+          <w:tcPr>
+            <w:tcW w:type="dxa" w:w="1080"/>
+            <w:shd w:val="clear" w:color="auto" w:fill="FFFFFF"/>
+          </w:tcPr>
+          <w:p>
+            <w:pPr>
+              <w:jc w:val="right"/>
+            </w:pPr>
+            <w:r/>
+            <w:r>
+              <w:rPr>
+                <w:rFonts w:ascii="Times New Roman" w:hAnsi="Times New Roman"/>
+                <w:b w:val="0"/>
+                <w:sz w:val="20"/>
+              </w:rPr>
+              <w:t>-1.07</w:t>
+            </w:r>
+          </w:p>
+        </w:tc>
+        <w:tc>
+          <w:tcPr>
+            <w:tcW w:type="dxa" w:w="1080"/>
+            <w:shd w:val="clear" w:color="auto" w:fill="FFFFFF"/>
+          </w:tcPr>
+          <w:p>
+            <w:pPr>
+              <w:jc w:val="right"/>
+            </w:pPr>
+            <w:r/>
+            <w:r>
+              <w:rPr>
+                <w:rFonts w:ascii="Times New Roman" w:hAnsi="Times New Roman"/>
+                <w:b w:val="0"/>
+                <w:sz w:val="20"/>
+              </w:rPr>
+              <w:t>0.143</w:t>
+            </w:r>
+          </w:p>
+        </w:tc>
+      </w:tr>
+      <w:tr>
+        <w:tc>
+          <w:tcPr>
+            <w:tcW w:type="dxa" w:w="1080"/>
+            <w:shd w:val="clear" w:color="auto" w:fill="F2F2F2"/>
+          </w:tcPr>
+          <w:p>
+            <w:pPr>
+              <w:jc w:val="left"/>
+            </w:pPr>
+            <w:r/>
+            <w:r>
+              <w:rPr>
+                <w:rFonts w:ascii="Times New Roman" w:hAnsi="Times New Roman"/>
+                <w:b w:val="0"/>
+                <w:sz w:val="20"/>
+              </w:rPr>
+              <w:t>Analysis 04: FC -&gt; Daily Affect</w:t>
+            </w:r>
+          </w:p>
+        </w:tc>
+        <w:tc>
+          <w:tcPr>
+            <w:tcW w:type="dxa" w:w="1080"/>
+            <w:shd w:val="clear" w:color="auto" w:fill="F2F2F2"/>
+          </w:tcPr>
+          <w:p>
+            <w:pPr>
+              <w:jc w:val="left"/>
+            </w:pPr>
+            <w:r/>
+            <w:r>
+              <w:rPr>
+                <w:rFonts w:ascii="Times New Roman" w:hAnsi="Times New Roman"/>
+                <w:b w:val="0"/>
+                <w:sz w:val="20"/>
+              </w:rPr>
+              <w:t>Left amygdala-post. vmPFC FC</w:t>
+            </w:r>
+          </w:p>
+        </w:tc>
+        <w:tc>
+          <w:tcPr>
+            <w:tcW w:type="dxa" w:w="1080"/>
+            <w:shd w:val="clear" w:color="auto" w:fill="F2F2F2"/>
+          </w:tcPr>
+          <w:p>
+            <w:pPr>
+              <w:jc w:val="left"/>
+            </w:pPr>
+            <w:r/>
+            <w:r>
+              <w:rPr>
+                <w:rFonts w:ascii="Times New Roman" w:hAnsi="Times New Roman"/>
+                <w:b w:val="0"/>
+                <w:sz w:val="20"/>
+              </w:rPr>
+              <w:t>Negative affect, log (diary)</w:t>
+            </w:r>
+          </w:p>
+        </w:tc>
+        <w:tc>
+          <w:tcPr>
+            <w:tcW w:type="dxa" w:w="1080"/>
+            <w:shd w:val="clear" w:color="auto" w:fill="F2F2F2"/>
+          </w:tcPr>
+          <w:p>
+            <w:pPr>
+              <w:jc w:val="right"/>
+            </w:pPr>
+            <w:r/>
+            <w:r>
+              <w:rPr>
+                <w:rFonts w:ascii="Times New Roman" w:hAnsi="Times New Roman"/>
+                <w:b w:val="0"/>
+                <w:sz w:val="20"/>
+              </w:rPr>
+              <w:t>81</w:t>
+            </w:r>
+          </w:p>
+        </w:tc>
+        <w:tc>
+          <w:tcPr>
+            <w:tcW w:type="dxa" w:w="1080"/>
+            <w:shd w:val="clear" w:color="auto" w:fill="F2F2F2"/>
+          </w:tcPr>
+          <w:p>
+            <w:pPr>
+              <w:jc w:val="right"/>
+            </w:pPr>
+            <w:r/>
+            <w:r>
+              <w:rPr>
+                <w:rFonts w:ascii="Times New Roman" w:hAnsi="Times New Roman"/>
+                <w:b w:val="0"/>
+                <w:sz w:val="20"/>
+              </w:rPr>
+              <w:t>-0.147</w:t>
+            </w:r>
+          </w:p>
+        </w:tc>
+        <w:tc>
+          <w:tcPr>
+            <w:tcW w:type="dxa" w:w="1080"/>
+            <w:shd w:val="clear" w:color="auto" w:fill="F2F2F2"/>
+          </w:tcPr>
+          <w:p>
+            <w:pPr>
+              <w:jc w:val="right"/>
+            </w:pPr>
+            <w:r/>
+            <w:r>
+              <w:rPr>
+                <w:rFonts w:ascii="Times New Roman" w:hAnsi="Times New Roman"/>
+                <w:b w:val="0"/>
+                <w:sz w:val="20"/>
+              </w:rPr>
+              <w:t>0.095</w:t>
+            </w:r>
+          </w:p>
+        </w:tc>
+        <w:tc>
+          <w:tcPr>
+            <w:tcW w:type="dxa" w:w="1080"/>
+            <w:shd w:val="clear" w:color="auto" w:fill="F2F2F2"/>
+          </w:tcPr>
+          <w:p>
+            <w:pPr>
+              <w:jc w:val="right"/>
+            </w:pPr>
+            <w:r/>
+            <w:r>
+              <w:rPr>
+                <w:rFonts w:ascii="Times New Roman" w:hAnsi="Times New Roman"/>
+                <w:b w:val="0"/>
+                <w:sz w:val="20"/>
+              </w:rPr>
+              <w:t>81</w:t>
+            </w:r>
+          </w:p>
+        </w:tc>
+        <w:tc>
+          <w:tcPr>
+            <w:tcW w:type="dxa" w:w="1080"/>
+            <w:shd w:val="clear" w:color="auto" w:fill="F2F2F2"/>
+          </w:tcPr>
+          <w:p>
+            <w:pPr>
+              <w:jc w:val="right"/>
+            </w:pPr>
+            <w:r/>
+            <w:r>
+              <w:rPr>
+                <w:rFonts w:ascii="Times New Roman" w:hAnsi="Times New Roman"/>
+                <w:b w:val="0"/>
+                <w:sz w:val="20"/>
+              </w:rPr>
+              <w:t>-0.77</w:t>
+            </w:r>
+          </w:p>
+        </w:tc>
+        <w:tc>
+          <w:tcPr>
+            <w:tcW w:type="dxa" w:w="1080"/>
+            <w:shd w:val="clear" w:color="auto" w:fill="F2F2F2"/>
+          </w:tcPr>
+          <w:p>
+            <w:pPr>
+              <w:jc w:val="right"/>
+            </w:pPr>
+            <w:r/>
+            <w:r>
+              <w:rPr>
+                <w:rFonts w:ascii="Times New Roman" w:hAnsi="Times New Roman"/>
+                <w:b w:val="0"/>
+                <w:sz w:val="20"/>
+              </w:rPr>
+              <w:t>0.221</w:t>
+            </w:r>
+          </w:p>
+        </w:tc>
+        <w:tc>
+          <w:tcPr>
+            <w:tcW w:type="dxa" w:w="1080"/>
+            <w:shd w:val="clear" w:color="auto" w:fill="F2F2F2"/>
+          </w:tcPr>
+          <w:p>
+            <w:pPr>
+              <w:jc w:val="right"/>
+            </w:pPr>
+            <w:r/>
+            <w:r>
+              <w:rPr>
+                <w:rFonts w:ascii="Times New Roman" w:hAnsi="Times New Roman"/>
+                <w:b w:val="0"/>
+                <w:sz w:val="20"/>
+              </w:rPr>
+              <w:t>81</w:t>
+            </w:r>
+          </w:p>
+        </w:tc>
+        <w:tc>
+          <w:tcPr>
+            <w:tcW w:type="dxa" w:w="1080"/>
+            <w:shd w:val="clear" w:color="auto" w:fill="F2F2F2"/>
+          </w:tcPr>
+          <w:p>
+            <w:pPr>
+              <w:jc w:val="right"/>
+            </w:pPr>
+            <w:r/>
+            <w:r>
+              <w:rPr>
+                <w:rFonts w:ascii="Times New Roman" w:hAnsi="Times New Roman"/>
+                <w:b w:val="0"/>
+                <w:sz w:val="20"/>
+              </w:rPr>
+              <w:t>-1.12</w:t>
+            </w:r>
+          </w:p>
+        </w:tc>
+        <w:tc>
+          <w:tcPr>
+            <w:tcW w:type="dxa" w:w="1080"/>
+            <w:shd w:val="clear" w:color="auto" w:fill="F2F2F2"/>
+          </w:tcPr>
+          <w:p>
+            <w:pPr>
+              <w:jc w:val="right"/>
+            </w:pPr>
+            <w:r/>
+            <w:r>
+              <w:rPr>
+                <w:rFonts w:ascii="Times New Roman" w:hAnsi="Times New Roman"/>
+                <w:b w:val="0"/>
+                <w:sz w:val="20"/>
+              </w:rPr>
+              <w:t>0.132</w:t>
+            </w:r>
+          </w:p>
+        </w:tc>
+      </w:tr>
+      <w:tr>
+        <w:tc>
+          <w:tcPr>
+            <w:tcW w:type="dxa" w:w="1080"/>
             <w:shd w:val="clear" w:color="auto" w:fill="D9D9D9"/>
           </w:tcPr>
           <w:p>
@@ -2905,7 +3469,7 @@
         </w:tc>
         <w:tc>
           <w:tcPr>
-            <w:tcW w:type="dxa" w:w="1296"/>
+            <w:tcW w:type="dxa" w:w="1080"/>
             <w:shd w:val="clear" w:color="auto" w:fill="D9D9D9"/>
           </w:tcPr>
           <w:p>
@@ -2925,7 +3489,7 @@
         </w:tc>
         <w:tc>
           <w:tcPr>
-            <w:tcW w:type="dxa" w:w="1296"/>
+            <w:tcW w:type="dxa" w:w="1080"/>
             <w:shd w:val="clear" w:color="auto" w:fill="D9D9D9"/>
           </w:tcPr>
           <w:p>
@@ -2945,7 +3509,7 @@
         </w:tc>
         <w:tc>
           <w:tcPr>
-            <w:tcW w:type="dxa" w:w="1296"/>
+            <w:tcW w:type="dxa" w:w="1080"/>
             <w:shd w:val="clear" w:color="auto" w:fill="D9D9D9"/>
           </w:tcPr>
           <w:p>
@@ -2959,13 +3523,13 @@
                 <w:b w:val="0"/>
                 <w:sz w:val="20"/>
               </w:rPr>
-              <w:t>128</w:t>
+              <w:t>127</w:t>
             </w:r>
           </w:p>
         </w:tc>
         <w:tc>
           <w:tcPr>
-            <w:tcW w:type="dxa" w:w="1296"/>
+            <w:tcW w:type="dxa" w:w="1080"/>
             <w:shd w:val="clear" w:color="auto" w:fill="D9D9D9"/>
           </w:tcPr>
           <w:p>
@@ -2979,13 +3543,13 @@
                 <w:b w:val="0"/>
                 <w:sz w:val="20"/>
               </w:rPr>
-              <w:t>0.103</w:t>
+              <w:t>-0.031</w:t>
             </w:r>
           </w:p>
         </w:tc>
         <w:tc>
           <w:tcPr>
-            <w:tcW w:type="dxa" w:w="1296"/>
+            <w:tcW w:type="dxa" w:w="1080"/>
             <w:shd w:val="clear" w:color="auto" w:fill="D9D9D9"/>
           </w:tcPr>
           <w:p>
@@ -2999,13 +3563,13 @@
                 <w:b w:val="0"/>
                 <w:sz w:val="20"/>
               </w:rPr>
-              <w:t>0.876</w:t>
+              <w:t>0.363</w:t>
             </w:r>
           </w:p>
         </w:tc>
         <w:tc>
           <w:tcPr>
-            <w:tcW w:type="dxa" w:w="1296"/>
+            <w:tcW w:type="dxa" w:w="1080"/>
             <w:shd w:val="clear" w:color="auto" w:fill="D9D9D9"/>
           </w:tcPr>
           <w:p>
@@ -3019,13 +3583,13 @@
                 <w:b w:val="0"/>
                 <w:sz w:val="20"/>
               </w:rPr>
-              <w:t>0.93</w:t>
+              <w:t>127</w:t>
             </w:r>
           </w:p>
         </w:tc>
         <w:tc>
           <w:tcPr>
-            <w:tcW w:type="dxa" w:w="1296"/>
+            <w:tcW w:type="dxa" w:w="1080"/>
             <w:shd w:val="clear" w:color="auto" w:fill="D9D9D9"/>
           </w:tcPr>
           <w:p>
@@ -3039,13 +3603,13 @@
                 <w:b w:val="0"/>
                 <w:sz w:val="20"/>
               </w:rPr>
-              <w:t>0.823</w:t>
+              <w:t>-0.43</w:t>
             </w:r>
           </w:p>
         </w:tc>
         <w:tc>
           <w:tcPr>
-            <w:tcW w:type="dxa" w:w="1296"/>
+            <w:tcW w:type="dxa" w:w="1080"/>
             <w:shd w:val="clear" w:color="auto" w:fill="D9D9D9"/>
           </w:tcPr>
           <w:p>
@@ -3059,13 +3623,13 @@
                 <w:b w:val="0"/>
                 <w:sz w:val="20"/>
               </w:rPr>
-              <w:t>1.19</w:t>
+              <w:t>0.333</w:t>
             </w:r>
           </w:p>
         </w:tc>
         <w:tc>
           <w:tcPr>
-            <w:tcW w:type="dxa" w:w="1296"/>
+            <w:tcW w:type="dxa" w:w="1080"/>
             <w:shd w:val="clear" w:color="auto" w:fill="D9D9D9"/>
           </w:tcPr>
           <w:p>
@@ -3079,7 +3643,47 @@
                 <w:b w:val="0"/>
                 <w:sz w:val="20"/>
               </w:rPr>
-              <w:t>0.882</w:t>
+              <w:t>127</w:t>
+            </w:r>
+          </w:p>
+        </w:tc>
+        <w:tc>
+          <w:tcPr>
+            <w:tcW w:type="dxa" w:w="1080"/>
+            <w:shd w:val="clear" w:color="auto" w:fill="D9D9D9"/>
+          </w:tcPr>
+          <w:p>
+            <w:pPr>
+              <w:jc w:val="right"/>
+            </w:pPr>
+            <w:r/>
+            <w:r>
+              <w:rPr>
+                <w:rFonts w:ascii="Times New Roman" w:hAnsi="Times New Roman"/>
+                <w:b w:val="0"/>
+                <w:sz w:val="20"/>
+              </w:rPr>
+              <w:t>-0.53</w:t>
+            </w:r>
+          </w:p>
+        </w:tc>
+        <w:tc>
+          <w:tcPr>
+            <w:tcW w:type="dxa" w:w="1080"/>
+            <w:shd w:val="clear" w:color="auto" w:fill="D9D9D9"/>
+          </w:tcPr>
+          <w:p>
+            <w:pPr>
+              <w:jc w:val="right"/>
+            </w:pPr>
+            <w:r/>
+            <w:r>
+              <w:rPr>
+                <w:rFonts w:ascii="Times New Roman" w:hAnsi="Times New Roman"/>
+                <w:b w:val="0"/>
+                <w:sz w:val="20"/>
+              </w:rPr>
+              <w:t>0.299</w:t>
             </w:r>
           </w:p>
         </w:tc>
@@ -3087,7 +3691,7 @@
       <w:tr>
         <w:tc>
           <w:tcPr>
-            <w:tcW w:type="dxa" w:w="1296"/>
+            <w:tcW w:type="dxa" w:w="1080"/>
             <w:shd w:val="clear" w:color="auto" w:fill="F2F2F2"/>
           </w:tcPr>
           <w:p>
@@ -3107,7 +3711,7 @@
         </w:tc>
         <w:tc>
           <w:tcPr>
-            <w:tcW w:type="dxa" w:w="1296"/>
+            <w:tcW w:type="dxa" w:w="1080"/>
             <w:shd w:val="clear" w:color="auto" w:fill="F2F2F2"/>
           </w:tcPr>
           <w:p>
@@ -3127,7 +3731,7 @@
         </w:tc>
         <w:tc>
           <w:tcPr>
-            <w:tcW w:type="dxa" w:w="1296"/>
+            <w:tcW w:type="dxa" w:w="1080"/>
             <w:shd w:val="clear" w:color="auto" w:fill="F2F2F2"/>
           </w:tcPr>
           <w:p>
@@ -3147,7 +3751,7 @@
         </w:tc>
         <w:tc>
           <w:tcPr>
-            <w:tcW w:type="dxa" w:w="1296"/>
+            <w:tcW w:type="dxa" w:w="1080"/>
             <w:shd w:val="clear" w:color="auto" w:fill="F2F2F2"/>
           </w:tcPr>
           <w:p>
@@ -3161,13 +3765,13 @@
                 <w:b w:val="0"/>
                 <w:sz w:val="20"/>
               </w:rPr>
-              <w:t>128</w:t>
+              <w:t>127</w:t>
             </w:r>
           </w:p>
         </w:tc>
         <w:tc>
           <w:tcPr>
-            <w:tcW w:type="dxa" w:w="1296"/>
+            <w:tcW w:type="dxa" w:w="1080"/>
             <w:shd w:val="clear" w:color="auto" w:fill="F2F2F2"/>
           </w:tcPr>
           <w:p>
@@ -3181,13 +3785,13 @@
                 <w:b w:val="0"/>
                 <w:sz w:val="20"/>
               </w:rPr>
-              <w:t>0.011</w:t>
+              <w:t>0.009</w:t>
             </w:r>
           </w:p>
         </w:tc>
         <w:tc>
           <w:tcPr>
-            <w:tcW w:type="dxa" w:w="1296"/>
+            <w:tcW w:type="dxa" w:w="1080"/>
             <w:shd w:val="clear" w:color="auto" w:fill="F2F2F2"/>
           </w:tcPr>
           <w:p>
@@ -3201,13 +3805,13 @@
                 <w:b w:val="0"/>
                 <w:sz w:val="20"/>
               </w:rPr>
-              <w:t>0.551</w:t>
+              <w:t>0.539</w:t>
             </w:r>
           </w:p>
         </w:tc>
         <w:tc>
           <w:tcPr>
-            <w:tcW w:type="dxa" w:w="1296"/>
+            <w:tcW w:type="dxa" w:w="1080"/>
             <w:shd w:val="clear" w:color="auto" w:fill="F2F2F2"/>
           </w:tcPr>
           <w:p>
@@ -3221,13 +3825,13 @@
                 <w:b w:val="0"/>
                 <w:sz w:val="20"/>
               </w:rPr>
-              <w:t>0.21</w:t>
+              <w:t>127</w:t>
             </w:r>
           </w:p>
         </w:tc>
         <w:tc>
           <w:tcPr>
-            <w:tcW w:type="dxa" w:w="1296"/>
+            <w:tcW w:type="dxa" w:w="1080"/>
             <w:shd w:val="clear" w:color="auto" w:fill="F2F2F2"/>
           </w:tcPr>
           <w:p>
@@ -3241,13 +3845,13 @@
                 <w:b w:val="0"/>
                 <w:sz w:val="20"/>
               </w:rPr>
-              <w:t>0.582</w:t>
+              <w:t>0.59</w:t>
             </w:r>
           </w:p>
         </w:tc>
         <w:tc>
           <w:tcPr>
-            <w:tcW w:type="dxa" w:w="1296"/>
+            <w:tcW w:type="dxa" w:w="1080"/>
             <w:shd w:val="clear" w:color="auto" w:fill="F2F2F2"/>
           </w:tcPr>
           <w:p>
@@ -3261,13 +3865,13 @@
                 <w:b w:val="0"/>
                 <w:sz w:val="20"/>
               </w:rPr>
-              <w:t>0.24</w:t>
+              <w:t>0.722</w:t>
             </w:r>
           </w:p>
         </w:tc>
         <w:tc>
           <w:tcPr>
-            <w:tcW w:type="dxa" w:w="1296"/>
+            <w:tcW w:type="dxa" w:w="1080"/>
             <w:shd w:val="clear" w:color="auto" w:fill="F2F2F2"/>
           </w:tcPr>
           <w:p>
@@ -3281,7 +3885,47 @@
                 <w:b w:val="0"/>
                 <w:sz w:val="20"/>
               </w:rPr>
-              <w:t>0.595</w:t>
+              <w:t>127</w:t>
+            </w:r>
+          </w:p>
+        </w:tc>
+        <w:tc>
+          <w:tcPr>
+            <w:tcW w:type="dxa" w:w="1080"/>
+            <w:shd w:val="clear" w:color="auto" w:fill="F2F2F2"/>
+          </w:tcPr>
+          <w:p>
+            <w:pPr>
+              <w:jc w:val="right"/>
+            </w:pPr>
+            <w:r/>
+            <w:r>
+              <w:rPr>
+                <w:rFonts w:ascii="Times New Roman" w:hAnsi="Times New Roman"/>
+                <w:b w:val="0"/>
+                <w:sz w:val="20"/>
+              </w:rPr>
+              <w:t>0.32</w:t>
+            </w:r>
+          </w:p>
+        </w:tc>
+        <w:tc>
+          <w:tcPr>
+            <w:tcW w:type="dxa" w:w="1080"/>
+            <w:shd w:val="clear" w:color="auto" w:fill="F2F2F2"/>
+          </w:tcPr>
+          <w:p>
+            <w:pPr>
+              <w:jc w:val="right"/>
+            </w:pPr>
+            <w:r/>
+            <w:r>
+              <w:rPr>
+                <w:rFonts w:ascii="Times New Roman" w:hAnsi="Times New Roman"/>
+                <w:b w:val="0"/>
+                <w:sz w:val="20"/>
+              </w:rPr>
+              <w:t>0.626</w:t>
             </w:r>
           </w:p>
         </w:tc>

</xml_diff>